<commit_message>
Added more detail to section regarding creation of SSH keys, and testing logins on remote nodes
</commit_message>
<xml_diff>
--- a/docs/MASS Java Developer Guide.docx
+++ b/docs/MASS Java Developer Guide.docx
@@ -1,6 +1,6 @@
 
 <file path=word/document.xml><?xml version="1.0" encoding="utf-8"?>
-<w:document xmlns:wpc="http://schemas.microsoft.com/office/word/2010/wordprocessingCanvas" xmlns:cx="http://schemas.microsoft.com/office/drawing/2014/chartex" xmlns:cx1="http://schemas.microsoft.com/office/drawing/2015/9/8/chartex" xmlns:cx2="http://schemas.microsoft.com/office/drawing/2015/10/21/chartex" xmlns:mc="http://schemas.openxmlformats.org/markup-compatibility/2006" xmlns:o="urn:schemas-microsoft-com:office:office" xmlns:r="http://schemas.openxmlformats.org/officeDocument/2006/relationships" xmlns:m="http://schemas.openxmlformats.org/officeDocument/2006/math" xmlns:v="urn:schemas-microsoft-com:vml" xmlns:wp14="http://schemas.microsoft.com/office/word/2010/wordprocessingDrawing" xmlns:wp="http://schemas.openxmlformats.org/drawingml/2006/wordprocessingDrawing" xmlns:w10="urn:schemas-microsoft-com:office:word" xmlns:w="http://schemas.openxmlformats.org/wordprocessingml/2006/main" xmlns:w14="http://schemas.microsoft.com/office/word/2010/wordml" xmlns:w15="http://schemas.microsoft.com/office/word/2012/wordml" xmlns:w16se="http://schemas.microsoft.com/office/word/2015/wordml/symex" xmlns:wpg="http://schemas.microsoft.com/office/word/2010/wordprocessingGroup" xmlns:wpi="http://schemas.microsoft.com/office/word/2010/wordprocessingInk" xmlns:wne="http://schemas.microsoft.com/office/word/2006/wordml" xmlns:wps="http://schemas.microsoft.com/office/word/2010/wordprocessingShape" mc:Ignorable="w14 w15 w16se wp14">
+<w:document xmlns:wpc="http://schemas.microsoft.com/office/word/2010/wordprocessingCanvas" xmlns:mc="http://schemas.openxmlformats.org/markup-compatibility/2006" xmlns:o="urn:schemas-microsoft-com:office:office" xmlns:r="http://schemas.openxmlformats.org/officeDocument/2006/relationships" xmlns:m="http://schemas.openxmlformats.org/officeDocument/2006/math" xmlns:v="urn:schemas-microsoft-com:vml" xmlns:wp14="http://schemas.microsoft.com/office/word/2010/wordprocessingDrawing" xmlns:wp="http://schemas.openxmlformats.org/drawingml/2006/wordprocessingDrawing" xmlns:w10="urn:schemas-microsoft-com:office:word" xmlns:w="http://schemas.openxmlformats.org/wordprocessingml/2006/main" xmlns:w14="http://schemas.microsoft.com/office/word/2010/wordml" xmlns:w15="http://schemas.microsoft.com/office/word/2012/wordml" xmlns:wpg="http://schemas.microsoft.com/office/word/2010/wordprocessingGroup" xmlns:wpi="http://schemas.microsoft.com/office/word/2010/wordprocessingInk" xmlns:wne="http://schemas.microsoft.com/office/word/2006/wordml" xmlns:wps="http://schemas.microsoft.com/office/word/2010/wordprocessingShape" mc:Ignorable="w14 w15 wp14">
   <w:body>
     <w:p>
       <w:pPr>
@@ -21,10 +21,7 @@
         <w:pStyle w:val="Subtitle"/>
       </w:pPr>
       <w:r>
-        <w:t xml:space="preserve">August </w:t>
-      </w:r>
-      <w:r>
-        <w:t>31</w:t>
+        <w:t>October 27</w:t>
       </w:r>
       <w:r>
         <w:t>, 2016</w:t>
@@ -34,29 +31,56 @@
       <w:pPr>
         <w:pStyle w:val="Heading1"/>
       </w:pPr>
-      <w:bookmarkStart w:id="0" w:name="_Toc460327682"/>
+      <w:bookmarkStart w:id="0" w:name="_Toc465367239"/>
       <w:r>
         <w:t>Intro</w:t>
       </w:r>
+      <w:r>
+        <w:t>duction</w:t>
+      </w:r>
       <w:bookmarkEnd w:id="0"/>
     </w:p>
     <w:p>
       <w:r>
-        <w:t xml:space="preserve">This document is to help understand the methods and rules for developing features for the MASS Java library and applications for it. </w:t>
+        <w:t xml:space="preserve">This document is to </w:t>
+      </w:r>
+      <w:r>
+        <w:t xml:space="preserve">help understand the methods, </w:t>
+      </w:r>
+      <w:r>
+        <w:t>rules</w:t>
+      </w:r>
+      <w:r>
+        <w:t>, and conventions</w:t>
+      </w:r>
+      <w:r>
+        <w:t xml:space="preserve"> for </w:t>
+      </w:r>
+      <w:r>
+        <w:t>contributing to</w:t>
+      </w:r>
+      <w:r>
+        <w:t xml:space="preserve"> the MASS Java</w:t>
+      </w:r>
+      <w:r>
+        <w:t xml:space="preserve"> library and related applications</w:t>
+      </w:r>
+      <w:r>
+        <w:t xml:space="preserve">. </w:t>
       </w:r>
     </w:p>
     <w:p>
       <w:pPr>
         <w:pStyle w:val="Heading1"/>
       </w:pPr>
-      <w:bookmarkStart w:id="1" w:name="_Toc460327683"/>
+      <w:bookmarkStart w:id="1" w:name="_Toc465367240"/>
       <w:r>
         <w:t>Table of Contents</w:t>
       </w:r>
-      <w:bookmarkStart w:id="2" w:name="_GoBack"/>
       <w:bookmarkEnd w:id="1"/>
-      <w:bookmarkEnd w:id="2"/>
-    </w:p>
+    </w:p>
+    <w:bookmarkStart w:id="2" w:name="_GoBack"/>
+    <w:bookmarkEnd w:id="2"/>
     <w:p>
       <w:pPr>
         <w:pStyle w:val="TOC1"/>
@@ -80,7 +104,7 @@
       <w:r>
         <w:fldChar w:fldCharType="separate"/>
       </w:r>
-      <w:hyperlink w:anchor="_Toc460327682" w:history="1">
+      <w:hyperlink w:anchor="_Toc465367239" w:history="1">
         <w:r>
           <w:rPr>
             <w:rStyle w:val="Hyperlink"/>
@@ -102,7 +126,7 @@
             <w:rStyle w:val="Hyperlink"/>
             <w:noProof/>
           </w:rPr>
-          <w:t>Intro</w:t>
+          <w:t>Introduction</w:t>
         </w:r>
         <w:r>
           <w:rPr>
@@ -123,7 +147,7 @@
             <w:noProof/>
             <w:webHidden/>
           </w:rPr>
-          <w:instrText xml:space="preserve"> PAGEREF _Toc460327682 \h </w:instrText>
+          <w:instrText xml:space="preserve"> PAGEREF _Toc465367239 \h </w:instrText>
         </w:r>
         <w:r>
           <w:rPr>
@@ -168,7 +192,7 @@
           <w:szCs w:val="22"/>
         </w:rPr>
       </w:pPr>
-      <w:hyperlink w:anchor="_Toc460327683" w:history="1">
+      <w:hyperlink w:anchor="_Toc465367240" w:history="1">
         <w:r>
           <w:rPr>
             <w:rStyle w:val="Hyperlink"/>
@@ -211,7 +235,7 @@
             <w:noProof/>
             <w:webHidden/>
           </w:rPr>
-          <w:instrText xml:space="preserve"> PAGEREF _Toc460327683 \h </w:instrText>
+          <w:instrText xml:space="preserve"> PAGEREF _Toc465367240 \h </w:instrText>
         </w:r>
         <w:r>
           <w:rPr>
@@ -256,7 +280,7 @@
           <w:szCs w:val="22"/>
         </w:rPr>
       </w:pPr>
-      <w:hyperlink w:anchor="_Toc460327684" w:history="1">
+      <w:hyperlink w:anchor="_Toc465367241" w:history="1">
         <w:r>
           <w:rPr>
             <w:rStyle w:val="Hyperlink"/>
@@ -278,7 +302,7 @@
             <w:rStyle w:val="Hyperlink"/>
             <w:noProof/>
           </w:rPr>
-          <w:t>Setup</w:t>
+          <w:t>Development Environment</w:t>
         </w:r>
         <w:r>
           <w:rPr>
@@ -299,7 +323,7 @@
             <w:noProof/>
             <w:webHidden/>
           </w:rPr>
-          <w:instrText xml:space="preserve"> PAGEREF _Toc460327684 \h </w:instrText>
+          <w:instrText xml:space="preserve"> PAGEREF _Toc465367241 \h </w:instrText>
         </w:r>
         <w:r>
           <w:rPr>
@@ -344,7 +368,7 @@
           <w:szCs w:val="22"/>
         </w:rPr>
       </w:pPr>
-      <w:hyperlink w:anchor="_Toc460327685" w:history="1">
+      <w:hyperlink w:anchor="_Toc465367242" w:history="1">
         <w:r>
           <w:rPr>
             <w:rStyle w:val="Hyperlink"/>
@@ -366,7 +390,7 @@
             <w:rStyle w:val="Hyperlink"/>
             <w:noProof/>
           </w:rPr>
-          <w:t>Location of MASS Java and Applications</w:t>
+          <w:t>Location of MASS Java and Applications Source Code</w:t>
         </w:r>
         <w:r>
           <w:rPr>
@@ -387,7 +411,7 @@
             <w:noProof/>
             <w:webHidden/>
           </w:rPr>
-          <w:instrText xml:space="preserve"> PAGEREF _Toc460327685 \h </w:instrText>
+          <w:instrText xml:space="preserve"> PAGEREF _Toc465367242 \h </w:instrText>
         </w:r>
         <w:r>
           <w:rPr>
@@ -432,7 +456,7 @@
           <w:szCs w:val="22"/>
         </w:rPr>
       </w:pPr>
-      <w:hyperlink w:anchor="_Toc460327686" w:history="1">
+      <w:hyperlink w:anchor="_Toc465367243" w:history="1">
         <w:r>
           <w:rPr>
             <w:rStyle w:val="Hyperlink"/>
@@ -475,7 +499,7 @@
             <w:noProof/>
             <w:webHidden/>
           </w:rPr>
-          <w:instrText xml:space="preserve"> PAGEREF _Toc460327686 \h </w:instrText>
+          <w:instrText xml:space="preserve"> PAGEREF _Toc465367243 \h </w:instrText>
         </w:r>
         <w:r>
           <w:rPr>
@@ -520,7 +544,7 @@
           <w:szCs w:val="22"/>
         </w:rPr>
       </w:pPr>
-      <w:hyperlink w:anchor="_Toc460327687" w:history="1">
+      <w:hyperlink w:anchor="_Toc465367244" w:history="1">
         <w:r>
           <w:rPr>
             <w:rStyle w:val="Hyperlink"/>
@@ -542,7 +566,7 @@
             <w:rStyle w:val="Hyperlink"/>
             <w:noProof/>
           </w:rPr>
-          <w:t>Environment</w:t>
+          <w:t>Execution Environment</w:t>
         </w:r>
         <w:r>
           <w:rPr>
@@ -563,7 +587,7 @@
             <w:noProof/>
             <w:webHidden/>
           </w:rPr>
-          <w:instrText xml:space="preserve"> PAGEREF _Toc460327687 \h </w:instrText>
+          <w:instrText xml:space="preserve"> PAGEREF _Toc465367244 \h </w:instrText>
         </w:r>
         <w:r>
           <w:rPr>
@@ -608,7 +632,7 @@
           <w:szCs w:val="22"/>
         </w:rPr>
       </w:pPr>
-      <w:hyperlink w:anchor="_Toc460327688" w:history="1">
+      <w:hyperlink w:anchor="_Toc465367245" w:history="1">
         <w:r>
           <w:rPr>
             <w:rStyle w:val="Hyperlink"/>
@@ -651,7 +675,7 @@
             <w:noProof/>
             <w:webHidden/>
           </w:rPr>
-          <w:instrText xml:space="preserve"> PAGEREF _Toc460327688 \h </w:instrText>
+          <w:instrText xml:space="preserve"> PAGEREF _Toc465367245 \h </w:instrText>
         </w:r>
         <w:r>
           <w:rPr>
@@ -696,7 +720,7 @@
           <w:szCs w:val="22"/>
         </w:rPr>
       </w:pPr>
-      <w:hyperlink w:anchor="_Toc460327689" w:history="1">
+      <w:hyperlink w:anchor="_Toc465367246" w:history="1">
         <w:r>
           <w:rPr>
             <w:rStyle w:val="Hyperlink"/>
@@ -739,7 +763,7 @@
             <w:noProof/>
             <w:webHidden/>
           </w:rPr>
-          <w:instrText xml:space="preserve"> PAGEREF _Toc460327689 \h </w:instrText>
+          <w:instrText xml:space="preserve"> PAGEREF _Toc465367246 \h </w:instrText>
         </w:r>
         <w:r>
           <w:rPr>
@@ -784,7 +808,7 @@
           <w:szCs w:val="22"/>
         </w:rPr>
       </w:pPr>
-      <w:hyperlink w:anchor="_Toc460327690" w:history="1">
+      <w:hyperlink w:anchor="_Toc465367247" w:history="1">
         <w:r>
           <w:rPr>
             <w:rStyle w:val="Hyperlink"/>
@@ -827,7 +851,7 @@
             <w:noProof/>
             <w:webHidden/>
           </w:rPr>
-          <w:instrText xml:space="preserve"> PAGEREF _Toc460327690 \h </w:instrText>
+          <w:instrText xml:space="preserve"> PAGEREF _Toc465367247 \h </w:instrText>
         </w:r>
         <w:r>
           <w:rPr>
@@ -847,7 +871,7 @@
             <w:noProof/>
             <w:webHidden/>
           </w:rPr>
-          <w:t>2</w:t>
+          <w:t>3</w:t>
         </w:r>
         <w:r>
           <w:rPr>
@@ -872,7 +896,7 @@
           <w:szCs w:val="22"/>
         </w:rPr>
       </w:pPr>
-      <w:hyperlink w:anchor="_Toc460327691" w:history="1">
+      <w:hyperlink w:anchor="_Toc465367248" w:history="1">
         <w:r>
           <w:rPr>
             <w:rStyle w:val="Hyperlink"/>
@@ -915,7 +939,7 @@
             <w:noProof/>
             <w:webHidden/>
           </w:rPr>
-          <w:instrText xml:space="preserve"> PAGEREF _Toc460327691 \h </w:instrText>
+          <w:instrText xml:space="preserve"> PAGEREF _Toc465367248 \h </w:instrText>
         </w:r>
         <w:r>
           <w:rPr>
@@ -960,7 +984,7 @@
           <w:szCs w:val="22"/>
         </w:rPr>
       </w:pPr>
-      <w:hyperlink w:anchor="_Toc460327692" w:history="1">
+      <w:hyperlink w:anchor="_Toc465367249" w:history="1">
         <w:r>
           <w:rPr>
             <w:rStyle w:val="Hyperlink"/>
@@ -1003,7 +1027,7 @@
             <w:noProof/>
             <w:webHidden/>
           </w:rPr>
-          <w:instrText xml:space="preserve"> PAGEREF _Toc460327692 \h </w:instrText>
+          <w:instrText xml:space="preserve"> PAGEREF _Toc465367249 \h </w:instrText>
         </w:r>
         <w:r>
           <w:rPr>
@@ -1048,7 +1072,7 @@
           <w:szCs w:val="22"/>
         </w:rPr>
       </w:pPr>
-      <w:hyperlink w:anchor="_Toc460327693" w:history="1">
+      <w:hyperlink w:anchor="_Toc465367250" w:history="1">
         <w:r>
           <w:rPr>
             <w:rStyle w:val="Hyperlink"/>
@@ -1091,7 +1115,7 @@
             <w:noProof/>
             <w:webHidden/>
           </w:rPr>
-          <w:instrText xml:space="preserve"> PAGEREF _Toc460327693 \h </w:instrText>
+          <w:instrText xml:space="preserve"> PAGEREF _Toc465367250 \h </w:instrText>
         </w:r>
         <w:r>
           <w:rPr>
@@ -1111,7 +1135,7 @@
             <w:noProof/>
             <w:webHidden/>
           </w:rPr>
-          <w:t>3</w:t>
+          <w:t>4</w:t>
         </w:r>
         <w:r>
           <w:rPr>
@@ -1136,7 +1160,7 @@
           <w:szCs w:val="22"/>
         </w:rPr>
       </w:pPr>
-      <w:hyperlink w:anchor="_Toc460327694" w:history="1">
+      <w:hyperlink w:anchor="_Toc465367251" w:history="1">
         <w:r>
           <w:rPr>
             <w:rStyle w:val="Hyperlink"/>
@@ -1179,7 +1203,7 @@
             <w:noProof/>
             <w:webHidden/>
           </w:rPr>
-          <w:instrText xml:space="preserve"> PAGEREF _Toc460327694 \h </w:instrText>
+          <w:instrText xml:space="preserve"> PAGEREF _Toc465367251 \h </w:instrText>
         </w:r>
         <w:r>
           <w:rPr>
@@ -1199,7 +1223,7 @@
             <w:noProof/>
             <w:webHidden/>
           </w:rPr>
-          <w:t>3</w:t>
+          <w:t>4</w:t>
         </w:r>
         <w:r>
           <w:rPr>
@@ -1224,7 +1248,7 @@
           <w:szCs w:val="22"/>
         </w:rPr>
       </w:pPr>
-      <w:hyperlink w:anchor="_Toc460327695" w:history="1">
+      <w:hyperlink w:anchor="_Toc465367252" w:history="1">
         <w:r>
           <w:rPr>
             <w:rStyle w:val="Hyperlink"/>
@@ -1267,7 +1291,7 @@
             <w:noProof/>
             <w:webHidden/>
           </w:rPr>
-          <w:instrText xml:space="preserve"> PAGEREF _Toc460327695 \h </w:instrText>
+          <w:instrText xml:space="preserve"> PAGEREF _Toc465367252 \h </w:instrText>
         </w:r>
         <w:r>
           <w:rPr>
@@ -1312,7 +1336,7 @@
           <w:szCs w:val="22"/>
         </w:rPr>
       </w:pPr>
-      <w:hyperlink w:anchor="_Toc460327696" w:history="1">
+      <w:hyperlink w:anchor="_Toc465367253" w:history="1">
         <w:r>
           <w:rPr>
             <w:rStyle w:val="Hyperlink"/>
@@ -1355,7 +1379,7 @@
             <w:noProof/>
             <w:webHidden/>
           </w:rPr>
-          <w:instrText xml:space="preserve"> PAGEREF _Toc460327696 \h </w:instrText>
+          <w:instrText xml:space="preserve"> PAGEREF _Toc465367253 \h </w:instrText>
         </w:r>
         <w:r>
           <w:rPr>
@@ -1400,7 +1424,7 @@
           <w:szCs w:val="22"/>
         </w:rPr>
       </w:pPr>
-      <w:hyperlink w:anchor="_Toc460327697" w:history="1">
+      <w:hyperlink w:anchor="_Toc465367254" w:history="1">
         <w:r>
           <w:rPr>
             <w:rStyle w:val="Hyperlink"/>
@@ -1443,7 +1467,7 @@
             <w:noProof/>
             <w:webHidden/>
           </w:rPr>
-          <w:instrText xml:space="preserve"> PAGEREF _Toc460327697 \h </w:instrText>
+          <w:instrText xml:space="preserve"> PAGEREF _Toc465367254 \h </w:instrText>
         </w:r>
         <w:r>
           <w:rPr>
@@ -1488,7 +1512,7 @@
           <w:szCs w:val="22"/>
         </w:rPr>
       </w:pPr>
-      <w:hyperlink w:anchor="_Toc460327698" w:history="1">
+      <w:hyperlink w:anchor="_Toc465367255" w:history="1">
         <w:r>
           <w:rPr>
             <w:rStyle w:val="Hyperlink"/>
@@ -1531,7 +1555,7 @@
             <w:noProof/>
             <w:webHidden/>
           </w:rPr>
-          <w:instrText xml:space="preserve"> PAGEREF _Toc460327698 \h </w:instrText>
+          <w:instrText xml:space="preserve"> PAGEREF _Toc465367255 \h </w:instrText>
         </w:r>
         <w:r>
           <w:rPr>
@@ -1551,7 +1575,7 @@
             <w:noProof/>
             <w:webHidden/>
           </w:rPr>
-          <w:t>5</w:t>
+          <w:t>6</w:t>
         </w:r>
         <w:r>
           <w:rPr>
@@ -1576,7 +1600,7 @@
           <w:szCs w:val="22"/>
         </w:rPr>
       </w:pPr>
-      <w:hyperlink w:anchor="_Toc460327699" w:history="1">
+      <w:hyperlink w:anchor="_Toc465367256" w:history="1">
         <w:r>
           <w:rPr>
             <w:rStyle w:val="Hyperlink"/>
@@ -1619,7 +1643,7 @@
             <w:noProof/>
             <w:webHidden/>
           </w:rPr>
-          <w:instrText xml:space="preserve"> PAGEREF _Toc460327699 \h </w:instrText>
+          <w:instrText xml:space="preserve"> PAGEREF _Toc465367256 \h </w:instrText>
         </w:r>
         <w:r>
           <w:rPr>
@@ -1639,7 +1663,7 @@
             <w:noProof/>
             <w:webHidden/>
           </w:rPr>
-          <w:t>5</w:t>
+          <w:t>6</w:t>
         </w:r>
         <w:r>
           <w:rPr>
@@ -1664,7 +1688,7 @@
           <w:szCs w:val="22"/>
         </w:rPr>
       </w:pPr>
-      <w:hyperlink w:anchor="_Toc460327700" w:history="1">
+      <w:hyperlink w:anchor="_Toc465367257" w:history="1">
         <w:r>
           <w:rPr>
             <w:rStyle w:val="Hyperlink"/>
@@ -1707,7 +1731,7 @@
             <w:noProof/>
             <w:webHidden/>
           </w:rPr>
-          <w:instrText xml:space="preserve"> PAGEREF _Toc460327700 \h </w:instrText>
+          <w:instrText xml:space="preserve"> PAGEREF _Toc465367257 \h </w:instrText>
         </w:r>
         <w:r>
           <w:rPr>
@@ -1727,7 +1751,7 @@
             <w:noProof/>
             <w:webHidden/>
           </w:rPr>
-          <w:t>6</w:t>
+          <w:t>7</w:t>
         </w:r>
         <w:r>
           <w:rPr>
@@ -1745,9 +1769,9 @@
       <w:r>
         <w:fldChar w:fldCharType="end"/>
       </w:r>
-      <w:bookmarkStart w:id="3" w:name="_Toc460327684"/>
-      <w:r>
-        <w:t>Setup</w:t>
+      <w:bookmarkStart w:id="3" w:name="_Toc465367241"/>
+      <w:r>
+        <w:t>Development Environment</w:t>
       </w:r>
       <w:bookmarkEnd w:id="3"/>
     </w:p>
@@ -1755,23 +1779,36 @@
       <w:pPr>
         <w:pStyle w:val="Heading2"/>
       </w:pPr>
-      <w:bookmarkStart w:id="4" w:name="_Toc460327685"/>
+      <w:bookmarkStart w:id="4" w:name="_Toc465367242"/>
       <w:r>
         <w:t>Location of MASS Java and Applications</w:t>
       </w:r>
+      <w:r>
+        <w:t xml:space="preserve"> Source Code</w:t>
+      </w:r>
       <w:bookmarkEnd w:id="4"/>
     </w:p>
     <w:p>
       <w:r>
-        <w:t xml:space="preserve">MASS Java is found in a BitBucket repository at </w:t>
+        <w:t xml:space="preserve">MASS Java is found in a </w:t>
+      </w:r>
+      <w:proofErr w:type="spellStart"/>
+      <w:r>
+        <w:t>BitBucket</w:t>
+      </w:r>
+      <w:proofErr w:type="spellEnd"/>
+      <w:r>
+        <w:t xml:space="preserve"> repository at </w:t>
       </w:r>
       <w:hyperlink r:id="rId8" w:history="1">
+        <w:proofErr w:type="spellStart"/>
         <w:r>
           <w:rPr>
             <w:rStyle w:val="Hyperlink"/>
           </w:rPr>
           <w:t>mass_java_core</w:t>
         </w:r>
+        <w:proofErr w:type="spellEnd"/>
       </w:hyperlink>
       <w:r>
         <w:t xml:space="preserve"> (the repository is private for now). The most current committed code is found in the </w:t>
@@ -1783,7 +1820,28 @@
         <w:t>develop</w:t>
       </w:r>
       <w:r>
-        <w:t xml:space="preserve"> branch, so if any work is to be done on the MASS Java library, do it on the code in that branch.</w:t>
+        <w:t xml:space="preserve"> branch</w:t>
+      </w:r>
+      <w:r>
+        <w:t>;</w:t>
+      </w:r>
+      <w:r>
+        <w:t xml:space="preserve"> </w:t>
+      </w:r>
+      <w:r>
+        <w:t xml:space="preserve">developers may make changes to the library in personal branches from the </w:t>
+      </w:r>
+      <w:r>
+        <w:rPr>
+          <w:b/>
+        </w:rPr>
+        <w:t>develop</w:t>
+      </w:r>
+      <w:r>
+        <w:t xml:space="preserve"> branch</w:t>
+      </w:r>
+      <w:r>
+        <w:t>.</w:t>
       </w:r>
     </w:p>
     <w:p>
@@ -1791,18 +1849,28 @@
         <w:t xml:space="preserve">The applications for MASS Java are, again, stored </w:t>
       </w:r>
       <w:r>
-        <w:t>in a BitBucket repository at</w:t>
+        <w:t xml:space="preserve">in a </w:t>
+      </w:r>
+      <w:proofErr w:type="spellStart"/>
+      <w:r>
+        <w:t>BitBucket</w:t>
+      </w:r>
+      <w:proofErr w:type="spellEnd"/>
+      <w:r>
+        <w:t xml:space="preserve"> repository at</w:t>
       </w:r>
       <w:r>
         <w:t xml:space="preserve"> </w:t>
       </w:r>
       <w:hyperlink r:id="rId9" w:history="1">
+        <w:proofErr w:type="spellStart"/>
         <w:r>
           <w:rPr>
             <w:rStyle w:val="Hyperlink"/>
           </w:rPr>
           <w:t>mass_java_appl</w:t>
         </w:r>
+        <w:proofErr w:type="spellEnd"/>
       </w:hyperlink>
       <w:r>
         <w:t xml:space="preserve"> (the repository is private for now). As with the code for the library, the most recent code is found in the </w:t>
@@ -1814,14 +1882,35 @@
         <w:t>develop</w:t>
       </w:r>
       <w:r>
-        <w:t xml:space="preserve"> branch, so work on the code based in that branch.</w:t>
+        <w:t xml:space="preserve"> branch. Again, create a personal branch from </w:t>
+      </w:r>
+      <w:r>
+        <w:rPr>
+          <w:b/>
+        </w:rPr>
+        <w:t>develop</w:t>
+      </w:r>
+      <w:r>
+        <w:t xml:space="preserve"> </w:t>
+      </w:r>
+      <w:r>
+        <w:t>and</w:t>
+      </w:r>
+      <w:r>
+        <w:t xml:space="preserve"> work on the code in </w:t>
+      </w:r>
+      <w:r>
+        <w:t>your</w:t>
+      </w:r>
+      <w:r>
+        <w:t xml:space="preserve"> branch.</w:t>
       </w:r>
     </w:p>
     <w:p>
       <w:pPr>
         <w:pStyle w:val="Heading2"/>
       </w:pPr>
-      <w:bookmarkStart w:id="5" w:name="_Toc460327686"/>
+      <w:bookmarkStart w:id="5" w:name="_Toc465367243"/>
       <w:r>
         <w:t>Getting a Copy of the Code for Development</w:t>
       </w:r>
@@ -1844,20 +1933,37 @@
           <w:rFonts w:ascii="Consolas" w:hAnsi="Consolas"/>
           <w:sz w:val="20"/>
         </w:rPr>
-        <w:t xml:space="preserve">$git clone </w:t>
-      </w:r>
+        <w:lastRenderedPageBreak/>
+        <w:t>$</w:t>
+      </w:r>
+      <w:proofErr w:type="spellStart"/>
       <w:r>
         <w:rPr>
           <w:rFonts w:ascii="Consolas" w:hAnsi="Consolas"/>
           <w:sz w:val="20"/>
         </w:rPr>
-        <w:t xml:space="preserve">-b develop </w:t>
-      </w:r>
+        <w:t>git</w:t>
+      </w:r>
+      <w:proofErr w:type="spellEnd"/>
       <w:r>
         <w:rPr>
           <w:rFonts w:ascii="Consolas" w:hAnsi="Consolas"/>
           <w:sz w:val="20"/>
         </w:rPr>
+        <w:t xml:space="preserve"> clone </w:t>
+      </w:r>
+      <w:r>
+        <w:rPr>
+          <w:rFonts w:ascii="Consolas" w:hAnsi="Consolas"/>
+          <w:sz w:val="20"/>
+        </w:rPr>
+        <w:t xml:space="preserve">-b develop </w:t>
+      </w:r>
+      <w:r>
+        <w:rPr>
+          <w:rFonts w:ascii="Consolas" w:hAnsi="Consolas"/>
+          <w:sz w:val="20"/>
+        </w:rPr>
         <w:t>https://bitbucket.org/mass_library_developers/mass_java_core</w:t>
       </w:r>
       <w:r>
@@ -1868,9 +1974,13 @@
       </w:r>
     </w:p>
     <w:p>
-      <w:r>
-        <w:lastRenderedPageBreak/>
-        <w:t xml:space="preserve">from the command line </w:t>
+      <w:proofErr w:type="gramStart"/>
+      <w:r>
+        <w:t>from</w:t>
+      </w:r>
+      <w:proofErr w:type="gramEnd"/>
+      <w:r>
+        <w:t xml:space="preserve"> the command line </w:t>
       </w:r>
       <w:r>
         <w:t xml:space="preserve">or by </w:t>
@@ -1903,7 +2013,10 @@
       <w:pPr>
         <w:pStyle w:val="Heading2"/>
       </w:pPr>
-      <w:bookmarkStart w:id="6" w:name="_Toc460327687"/>
+      <w:bookmarkStart w:id="6" w:name="_Toc465367244"/>
+      <w:r>
+        <w:t xml:space="preserve">Execution </w:t>
+      </w:r>
       <w:r>
         <w:t>Environment</w:t>
       </w:r>
@@ -1911,7 +2024,27 @@
     </w:p>
     <w:p>
       <w:r>
-        <w:t>MASS requires the use of multiple computing nodes and it is required that the master node to connect to the remote nodes by using SSH without a password. To do this, a private key needs to be created. If running MASS on a distributed file system, type the following commands into the terminal.</w:t>
+        <w:t>When the MASS library initializes, it will connect to remote (follower) nodes defined in “nodes.xml” and launch remote processes automatically. This process requires MASS to be able to connect and authenticate to the remote nodes using SSH. Authentication is accomplished using public and private keys.</w:t>
+      </w:r>
+    </w:p>
+    <w:p>
+      <w:r>
+        <w:t xml:space="preserve">To </w:t>
+      </w:r>
+      <w:r>
+        <w:t>generate these keys</w:t>
+      </w:r>
+      <w:r>
+        <w:t xml:space="preserve">, </w:t>
+      </w:r>
+      <w:r>
+        <w:t xml:space="preserve">log in to a Linux lab computer and </w:t>
+      </w:r>
+      <w:r>
+        <w:t>type the follo</w:t>
+      </w:r>
+      <w:r>
+        <w:t>wing commands into the terminal:</w:t>
       </w:r>
     </w:p>
     <w:p>
@@ -1928,7 +2061,23 @@
           <w:rFonts w:ascii="Consolas" w:hAnsi="Consolas"/>
           <w:sz w:val="20"/>
         </w:rPr>
-        <w:t>$cd ~/.ssh/</w:t>
+        <w:t>$cd ~/.</w:t>
+      </w:r>
+      <w:proofErr w:type="spellStart"/>
+      <w:r>
+        <w:rPr>
+          <w:rFonts w:ascii="Consolas" w:hAnsi="Consolas"/>
+          <w:sz w:val="20"/>
+        </w:rPr>
+        <w:t>ssh</w:t>
+      </w:r>
+      <w:proofErr w:type="spellEnd"/>
+      <w:r>
+        <w:rPr>
+          <w:rFonts w:ascii="Consolas" w:hAnsi="Consolas"/>
+          <w:sz w:val="20"/>
+        </w:rPr>
+        <w:t>/</w:t>
       </w:r>
     </w:p>
     <w:p>
@@ -1945,35 +2094,285 @@
           <w:rFonts w:ascii="Consolas" w:hAnsi="Consolas"/>
           <w:sz w:val="20"/>
         </w:rPr>
-        <w:t>$ssh-keygen -t rsa</w:t>
-      </w:r>
-    </w:p>
-    <w:p>
-      <w:pPr>
-        <w:ind w:left="720"/>
+        <w:t>$</w:t>
+      </w:r>
+      <w:proofErr w:type="spellStart"/>
+      <w:r>
         <w:rPr>
           <w:rFonts w:ascii="Consolas" w:hAnsi="Consolas"/>
           <w:sz w:val="20"/>
         </w:rPr>
-      </w:pPr>
+        <w:t>ssh-keygen</w:t>
+      </w:r>
+      <w:proofErr w:type="spellEnd"/>
       <w:r>
         <w:rPr>
           <w:rFonts w:ascii="Consolas" w:hAnsi="Consolas"/>
           <w:sz w:val="20"/>
         </w:rPr>
-        <w:t>$mv id_rsa.pub authorized_keys</w:t>
-      </w:r>
-    </w:p>
-    <w:p>
-      <w:r>
-        <w:t>When prompted in the ssh-keygen command, just press enter to accept the default value. Make sure not to include a passphrase, because the MASS code does not allow for one. Just press enter when prompted for one. You can test to see if this works by SSH’ing into a different computer in the cluster.</w:t>
+        <w:t xml:space="preserve"> -t </w:t>
+      </w:r>
+      <w:proofErr w:type="spellStart"/>
+      <w:r>
+        <w:rPr>
+          <w:rFonts w:ascii="Consolas" w:hAnsi="Consolas"/>
+          <w:sz w:val="20"/>
+        </w:rPr>
+        <w:t>rsa</w:t>
+      </w:r>
+      <w:proofErr w:type="spellEnd"/>
+    </w:p>
+    <w:p>
+      <w:pPr>
+        <w:ind w:left="720"/>
+        <w:rPr>
+          <w:rFonts w:ascii="Consolas" w:hAnsi="Consolas"/>
+          <w:sz w:val="20"/>
+        </w:rPr>
+      </w:pPr>
+      <w:r>
+        <w:rPr>
+          <w:rFonts w:ascii="Consolas" w:hAnsi="Consolas"/>
+          <w:sz w:val="20"/>
+        </w:rPr>
+        <w:t>$</w:t>
+      </w:r>
+      <w:proofErr w:type="spellStart"/>
+      <w:r>
+        <w:rPr>
+          <w:rFonts w:ascii="Consolas" w:hAnsi="Consolas"/>
+          <w:sz w:val="20"/>
+        </w:rPr>
+        <w:t>cp</w:t>
+      </w:r>
+      <w:proofErr w:type="spellEnd"/>
+      <w:r>
+        <w:rPr>
+          <w:rFonts w:ascii="Consolas" w:hAnsi="Consolas"/>
+          <w:sz w:val="20"/>
+        </w:rPr>
+        <w:t xml:space="preserve"> id_rsa.pub </w:t>
+      </w:r>
+      <w:proofErr w:type="spellStart"/>
+      <w:r>
+        <w:rPr>
+          <w:rFonts w:ascii="Consolas" w:hAnsi="Consolas"/>
+          <w:sz w:val="20"/>
+        </w:rPr>
+        <w:t>authorized_keys</w:t>
+      </w:r>
+      <w:proofErr w:type="spellEnd"/>
+    </w:p>
+    <w:p>
+      <w:pPr>
+        <w:pStyle w:val="ListParagraph"/>
+        <w:numPr>
+          <w:ilvl w:val="0"/>
+          <w:numId w:val="8"/>
+        </w:numPr>
+      </w:pPr>
+      <w:r>
+        <w:t xml:space="preserve">When prompted </w:t>
+      </w:r>
+      <w:r>
+        <w:t>to “</w:t>
+      </w:r>
+      <w:r>
+        <w:t>Enter file in which to save the key</w:t>
+      </w:r>
+      <w:r>
+        <w:t>”</w:t>
+      </w:r>
+      <w:r>
+        <w:t xml:space="preserve">, press enter to accept the default value. </w:t>
+      </w:r>
+    </w:p>
+    <w:p>
+      <w:pPr>
+        <w:pStyle w:val="ListParagraph"/>
+        <w:numPr>
+          <w:ilvl w:val="0"/>
+          <w:numId w:val="8"/>
+        </w:numPr>
+      </w:pPr>
+      <w:r>
+        <w:t>Make sure not to include a passphrase</w:t>
+      </w:r>
+      <w:r>
+        <w:t>;</w:t>
+      </w:r>
+      <w:r>
+        <w:t xml:space="preserve"> </w:t>
+      </w:r>
+      <w:r>
+        <w:t xml:space="preserve">the </w:t>
+      </w:r>
+      <w:r>
+        <w:t xml:space="preserve">MASS </w:t>
+      </w:r>
+      <w:r>
+        <w:t>library will not be able to send a passphrase to the remote node</w:t>
+      </w:r>
+      <w:r>
+        <w:t xml:space="preserve">. </w:t>
+      </w:r>
+      <w:r>
+        <w:t>P</w:t>
+      </w:r>
+      <w:r>
+        <w:t xml:space="preserve">ress enter when prompted for </w:t>
+      </w:r>
+      <w:r>
+        <w:t>a passphrase (twice!)</w:t>
+      </w:r>
+    </w:p>
+    <w:p>
+      <w:r>
+        <w:rPr>
+          <w:b/>
+        </w:rPr>
+        <w:t>NOTE:</w:t>
+      </w:r>
+      <w:r>
+        <w:t xml:space="preserve"> </w:t>
+      </w:r>
+      <w:r>
+        <w:t xml:space="preserve">You </w:t>
+      </w:r>
+      <w:r>
+        <w:t>should</w:t>
+      </w:r>
+      <w:r>
+        <w:t xml:space="preserve"> test </w:t>
+      </w:r>
+      <w:r>
+        <w:t>for proper authentication on remote nodes</w:t>
+      </w:r>
+      <w:r>
+        <w:t xml:space="preserve"> by </w:t>
+      </w:r>
+      <w:r>
+        <w:t xml:space="preserve">connecting </w:t>
+      </w:r>
+      <w:r>
+        <w:t>to a different computer in the cluster.</w:t>
+      </w:r>
+      <w:r>
+        <w:t xml:space="preserve"> Enter the following to connect to a different node (using node “02” as an example):</w:t>
+      </w:r>
+    </w:p>
+    <w:p>
+      <w:pPr>
+        <w:spacing w:after="0"/>
+        <w:ind w:left="720"/>
+        <w:rPr>
+          <w:rFonts w:ascii="Consolas" w:hAnsi="Consolas"/>
+          <w:sz w:val="20"/>
+        </w:rPr>
+      </w:pPr>
+      <w:r>
+        <w:rPr>
+          <w:rFonts w:ascii="Consolas" w:hAnsi="Consolas"/>
+          <w:sz w:val="20"/>
+        </w:rPr>
+        <w:t>$</w:t>
+      </w:r>
+      <w:proofErr w:type="spellStart"/>
+      <w:proofErr w:type="gramStart"/>
+      <w:r>
+        <w:rPr>
+          <w:rFonts w:ascii="Consolas" w:hAnsi="Consolas"/>
+          <w:sz w:val="20"/>
+        </w:rPr>
+        <w:t>ssh</w:t>
+      </w:r>
+      <w:proofErr w:type="spellEnd"/>
+      <w:proofErr w:type="gramEnd"/>
+      <w:r>
+        <w:rPr>
+          <w:rFonts w:ascii="Consolas" w:hAnsi="Consolas"/>
+          <w:sz w:val="20"/>
+        </w:rPr>
+        <w:t xml:space="preserve"> uw1-320-02</w:t>
+      </w:r>
+    </w:p>
+    <w:p>
+      <w:r>
+        <w:t>You may receive a prompt similar to “</w:t>
+      </w:r>
+      <w:r>
+        <w:t>The authenticity of host 'uw1-320-02</w:t>
+      </w:r>
+      <w:r>
+        <w:t xml:space="preserve"> </w:t>
+      </w:r>
+      <w:r>
+        <w:t>can't be established</w:t>
+      </w:r>
+      <w:r>
+        <w:t>…”</w:t>
+      </w:r>
+      <w:r>
+        <w:t xml:space="preserve"> </w:t>
+      </w:r>
+      <w:r>
+        <w:t>Enter “yes” and press enter to acknowledge this prompt.</w:t>
+      </w:r>
+    </w:p>
+    <w:p>
+      <w:r>
+        <w:t>You should be connected to the remote machine without having to enter your username or password. If you are prompted to enter one or both of username/password, then SSH key generation did not complete properly. Delete the “</w:t>
+      </w:r>
+      <w:proofErr w:type="spellStart"/>
+      <w:r>
+        <w:t>authorized_keys</w:t>
+      </w:r>
+      <w:proofErr w:type="spellEnd"/>
+      <w:r>
+        <w:t>”, “id_rsa.pub”, and “</w:t>
+      </w:r>
+      <w:proofErr w:type="spellStart"/>
+      <w:r>
+        <w:t>id_rsa</w:t>
+      </w:r>
+      <w:proofErr w:type="spellEnd"/>
+      <w:r>
+        <w:t>” files from your “.</w:t>
+      </w:r>
+      <w:proofErr w:type="spellStart"/>
+      <w:r>
+        <w:t>ssh</w:t>
+      </w:r>
+      <w:proofErr w:type="spellEnd"/>
+      <w:r>
+        <w:t>” directory and retry the key generation steps.</w:t>
+      </w:r>
+    </w:p>
+    <w:p>
+      <w:pPr>
+        <w:rPr>
+          <w:b/>
+          <w:i/>
+        </w:rPr>
+      </w:pPr>
+      <w:r>
+        <w:rPr>
+          <w:b/>
+          <w:i/>
+        </w:rPr>
+        <w:t>MASS Applications will not run in a clustered environment unless SSH keys are properly configured and these tests are successful!</w:t>
+      </w:r>
+    </w:p>
+    <w:p>
+      <w:r>
+        <w:t>It is recommended that you perform this test for each node specified in “nodes.xml”, connecting from the nodes designated as the master in your configuration. Performing this simple test will prevent difficulties later when attempting to run your applications!</w:t>
       </w:r>
     </w:p>
     <w:p>
       <w:pPr>
         <w:pStyle w:val="Heading1"/>
       </w:pPr>
-      <w:bookmarkStart w:id="7" w:name="_Toc460327688"/>
+      <w:bookmarkStart w:id="7" w:name="_Toc465367245"/>
       <w:r>
         <w:t>Making Changes to MASS</w:t>
       </w:r>
@@ -1983,7 +2382,7 @@
       <w:pPr>
         <w:pStyle w:val="Heading2"/>
       </w:pPr>
-      <w:bookmarkStart w:id="8" w:name="_Toc460327689"/>
+      <w:bookmarkStart w:id="8" w:name="_Toc465367246"/>
       <w:r>
         <w:t>Pushing Changes</w:t>
       </w:r>
@@ -2001,7 +2400,23 @@
           <w:i/>
           <w:szCs w:val="20"/>
         </w:rPr>
-        <w:t xml:space="preserve">~/Training/GitTraining$ </w:t>
+        <w:t>~/Training/</w:t>
+      </w:r>
+      <w:proofErr w:type="spellStart"/>
+      <w:r>
+        <w:rPr>
+          <w:i/>
+          <w:szCs w:val="20"/>
+        </w:rPr>
+        <w:t>GitTraining</w:t>
+      </w:r>
+      <w:proofErr w:type="spellEnd"/>
+      <w:r>
+        <w:rPr>
+          <w:i/>
+          <w:szCs w:val="20"/>
+        </w:rPr>
+        <w:t xml:space="preserve">$ </w:t>
       </w:r>
       <w:r>
         <w:t xml:space="preserve">directory </w:t>
@@ -2015,6 +2430,7 @@
     </w:p>
     <w:p>
       <w:r>
+        <w:lastRenderedPageBreak/>
         <w:t>If you want to add a feature, branch off of the develop branch and commit changes to that branch. When you are finished with your feature, and it is tested, merge your branch to the develop branch and fix any merge conflicts if they show up.</w:t>
       </w:r>
     </w:p>
@@ -2022,7 +2438,7 @@
       <w:pPr>
         <w:pStyle w:val="Heading2"/>
       </w:pPr>
-      <w:bookmarkStart w:id="9" w:name="_Toc460327690"/>
+      <w:bookmarkStart w:id="9" w:name="_Toc465367247"/>
       <w:r>
         <w:t>Building MASS</w:t>
       </w:r>
@@ -2052,7 +2468,15 @@
     </w:p>
     <w:p>
       <w:r>
-        <w:t xml:space="preserve">Many Java IDEs include support for Maven, either natively or with a plugin, and can build the library from there. Refer to the IDE documentation for Maven to learn how to set this up. Maven can also build projects from the command line if the Maven and javac executables are in the system path. Typing </w:t>
+        <w:t xml:space="preserve">Many Java IDEs include support for Maven, either natively or with a plugin, and can build the library from there. Refer to the IDE documentation for Maven to learn how to set this up. Maven can also build projects from the command line if the Maven and </w:t>
+      </w:r>
+      <w:proofErr w:type="spellStart"/>
+      <w:r>
+        <w:t>javac</w:t>
+      </w:r>
+      <w:proofErr w:type="spellEnd"/>
+      <w:r>
+        <w:t xml:space="preserve"> executables are in the system path. Typing </w:t>
       </w:r>
     </w:p>
     <w:p>
@@ -2070,155 +2494,207 @@
           <w:sz w:val="20"/>
           <w:szCs w:val="20"/>
         </w:rPr>
-        <w:t xml:space="preserve">$mvn package </w:t>
-      </w:r>
-    </w:p>
-    <w:p>
-      <w:r>
-        <w:t xml:space="preserve">from the command line in the directory where the </w:t>
-      </w:r>
-      <w:r>
-        <w:rPr>
-          <w:i/>
-        </w:rPr>
-        <w:t>pom.xml</w:t>
-      </w:r>
-      <w:r>
-        <w:t xml:space="preserve"> is located will begin the build process. Maven will download any necessary dependencies, compile the classes, and create the final JAR executable. The JAR executable will be located in the </w:t>
-      </w:r>
-      <w:r>
-        <w:rPr>
-          <w:i/>
-        </w:rPr>
-        <w:t>target</w:t>
-      </w:r>
-      <w:r>
-        <w:rPr>
-          <w:sz w:val="32"/>
-        </w:rPr>
-        <w:t xml:space="preserve"> </w:t>
-      </w:r>
-      <w:r>
-        <w:t xml:space="preserve">directory, even if you used the IDE invocation method. </w:t>
-      </w:r>
-    </w:p>
-    <w:p>
-      <w:r>
-        <w:t xml:space="preserve">If you wish to include your most recently built MASS library in an application, type </w:t>
-      </w:r>
-    </w:p>
-    <w:p>
-      <w:pPr>
-        <w:ind w:left="720"/>
+        <w:t>$</w:t>
+      </w:r>
+      <w:proofErr w:type="spellStart"/>
+      <w:r>
         <w:rPr>
           <w:rFonts w:ascii="Consolas" w:hAnsi="Consolas"/>
           <w:sz w:val="20"/>
           <w:szCs w:val="20"/>
         </w:rPr>
-      </w:pPr>
+        <w:t>mvn</w:t>
+      </w:r>
+      <w:proofErr w:type="spellEnd"/>
       <w:r>
         <w:rPr>
           <w:rFonts w:ascii="Consolas" w:hAnsi="Consolas"/>
           <w:sz w:val="20"/>
           <w:szCs w:val="20"/>
         </w:rPr>
-        <w:t xml:space="preserve">$mvn clean package install </w:t>
-      </w:r>
-    </w:p>
-    <w:p>
-      <w:r>
-        <w:t>to save the newly created JAR in your local Maven repository.</w:t>
+        <w:t xml:space="preserve"> package </w:t>
+      </w:r>
+    </w:p>
+    <w:p>
+      <w:proofErr w:type="gramStart"/>
+      <w:r>
+        <w:t>from</w:t>
+      </w:r>
+      <w:proofErr w:type="gramEnd"/>
+      <w:r>
+        <w:t xml:space="preserve"> the command line in the directory where the </w:t>
+      </w:r>
+      <w:r>
+        <w:rPr>
+          <w:i/>
+        </w:rPr>
+        <w:t>pom.xml</w:t>
+      </w:r>
+      <w:r>
+        <w:t xml:space="preserve"> is located will begin the build process. Maven will download any necessary dependencies, compile the classes, and create the final JAR executable. The JAR executable will be located in the </w:t>
+      </w:r>
+      <w:r>
+        <w:rPr>
+          <w:i/>
+        </w:rPr>
+        <w:t>target</w:t>
+      </w:r>
+      <w:r>
+        <w:rPr>
+          <w:sz w:val="32"/>
+        </w:rPr>
+        <w:t xml:space="preserve"> </w:t>
+      </w:r>
+      <w:r>
+        <w:t xml:space="preserve">directory, even if you used the IDE invocation method. </w:t>
+      </w:r>
+    </w:p>
+    <w:p>
+      <w:r>
+        <w:t xml:space="preserve">If you wish to include your most recently built MASS library in an application, type </w:t>
+      </w:r>
+    </w:p>
+    <w:p>
+      <w:pPr>
+        <w:ind w:left="720"/>
+        <w:rPr>
+          <w:rFonts w:ascii="Consolas" w:hAnsi="Consolas"/>
+          <w:sz w:val="20"/>
+          <w:szCs w:val="20"/>
+        </w:rPr>
+      </w:pPr>
+      <w:r>
+        <w:rPr>
+          <w:rFonts w:ascii="Consolas" w:hAnsi="Consolas"/>
+          <w:sz w:val="20"/>
+          <w:szCs w:val="20"/>
+        </w:rPr>
+        <w:t>$</w:t>
+      </w:r>
+      <w:proofErr w:type="spellStart"/>
+      <w:r>
+        <w:rPr>
+          <w:rFonts w:ascii="Consolas" w:hAnsi="Consolas"/>
+          <w:sz w:val="20"/>
+          <w:szCs w:val="20"/>
+        </w:rPr>
+        <w:t>mvn</w:t>
+      </w:r>
+      <w:proofErr w:type="spellEnd"/>
+      <w:r>
+        <w:rPr>
+          <w:rFonts w:ascii="Consolas" w:hAnsi="Consolas"/>
+          <w:sz w:val="20"/>
+          <w:szCs w:val="20"/>
+        </w:rPr>
+        <w:t xml:space="preserve"> clean package install </w:t>
+      </w:r>
+    </w:p>
+    <w:p>
+      <w:proofErr w:type="gramStart"/>
+      <w:r>
+        <w:t>to</w:t>
+      </w:r>
+      <w:proofErr w:type="gramEnd"/>
+      <w:r>
+        <w:t xml:space="preserve"> save the newly created JAR in your local Maven repository.</w:t>
       </w:r>
     </w:p>
     <w:p>
       <w:pPr>
         <w:pStyle w:val="Heading2"/>
       </w:pPr>
-      <w:bookmarkStart w:id="10" w:name="_Toc460327691"/>
+      <w:bookmarkStart w:id="10" w:name="_Toc465367248"/>
+      <w:r>
+        <w:t>Testing Changes</w:t>
+      </w:r>
+      <w:bookmarkEnd w:id="10"/>
+    </w:p>
+    <w:p>
+      <w:r>
+        <w:t xml:space="preserve">Changes in MASS are to be tested with simple MASS applications, which are also Maven projects. The process for creating, compiling and running them are found below. </w:t>
+      </w:r>
+    </w:p>
+    <w:p>
+      <w:pPr>
+        <w:pStyle w:val="Heading2"/>
+      </w:pPr>
+      <w:bookmarkStart w:id="11" w:name="_Toc465367249"/>
+      <w:r>
+        <w:t>Debugging MASS</w:t>
+      </w:r>
+      <w:bookmarkEnd w:id="11"/>
+    </w:p>
+    <w:p>
+      <w:r>
+        <w:t xml:space="preserve">Included within MASS, is a package named </w:t>
+      </w:r>
+      <w:proofErr w:type="spellStart"/>
+      <w:r>
+        <w:rPr>
+          <w:i/>
+        </w:rPr>
+        <w:t>edu.uw.bothell.css.dsl.MASS.logging</w:t>
+      </w:r>
+      <w:proofErr w:type="spellEnd"/>
+      <w:r>
+        <w:t xml:space="preserve"> that writes error and debug messages to a file. Currently, only error messages are written to the logs, but debugging messages can be set to be written to the log. Setting the DEFAULT_LOG_LEVEL variable in Log4J2Logger.java to </w:t>
+      </w:r>
+      <w:proofErr w:type="spellStart"/>
+      <w:r>
+        <w:rPr>
+          <w:i/>
+        </w:rPr>
+        <w:t>LogLevel.DEBUG</w:t>
+      </w:r>
+      <w:proofErr w:type="spellEnd"/>
+      <w:r>
+        <w:t xml:space="preserve"> will allow debug messages to be written to the log files. The log files are written to a text document that can be found in the log/ subdirectory that is created where MASS is run. MASS will create a file for each node, so each node can be debugged separately.</w:t>
+      </w:r>
+    </w:p>
+    <w:p>
+      <w:r>
+        <w:t xml:space="preserve">The log files can be quite large and difficult to find useful information in them if the debug messages are set, so it is recommended to run the MASS application with a small </w:t>
+      </w:r>
+      <w:r>
+        <w:t>number</w:t>
+      </w:r>
+      <w:r>
+        <w:t xml:space="preserve"> of Places and Agents. Also, if the MASS application is being run somewhere with limited disk space, it is recommended to delete the log files or to move them somewhere else, otherwise Java will crash.</w:t>
+      </w:r>
+    </w:p>
+    <w:p>
+      <w:r>
+        <w:t xml:space="preserve">To debug the methods available to the user, the </w:t>
+      </w:r>
+      <w:proofErr w:type="spellStart"/>
+      <w:r>
+        <w:rPr>
+          <w:i/>
+        </w:rPr>
+        <w:t>printOutput</w:t>
+      </w:r>
+      <w:proofErr w:type="spellEnd"/>
+      <w:r>
+        <w:t xml:space="preserve"> variable in MASS.java can be set too true. This will print status messages to the command line. </w:t>
+      </w:r>
+    </w:p>
+    <w:p>
+      <w:pPr>
+        <w:pStyle w:val="Heading1"/>
+      </w:pPr>
+      <w:bookmarkStart w:id="12" w:name="_Toc465367250"/>
       <w:r>
         <w:lastRenderedPageBreak/>
-        <w:t>Testing Changes</w:t>
-      </w:r>
-      <w:bookmarkEnd w:id="10"/>
-    </w:p>
-    <w:p>
-      <w:r>
-        <w:t xml:space="preserve">Changes in MASS are to be tested with simple MASS applications, which are also Maven projects. The process for creating, compiling and running them are found below. </w:t>
-      </w:r>
+        <w:t>MASS Components</w:t>
+      </w:r>
+      <w:bookmarkEnd w:id="12"/>
     </w:p>
     <w:p>
       <w:pPr>
         <w:pStyle w:val="Heading2"/>
       </w:pPr>
-      <w:bookmarkStart w:id="11" w:name="_Toc460327692"/>
-      <w:r>
-        <w:t>Debugging MASS</w:t>
-      </w:r>
-      <w:bookmarkEnd w:id="11"/>
-    </w:p>
-    <w:p>
-      <w:r>
-        <w:t xml:space="preserve">Included within MASS, is a package named </w:t>
-      </w:r>
-      <w:r>
-        <w:rPr>
-          <w:i/>
-        </w:rPr>
-        <w:t>edu.uw.bothell.css.dsl.MASS.logging</w:t>
-      </w:r>
-      <w:r>
-        <w:t xml:space="preserve"> that writes error and debug messages to a file. Currently, only error messages are written to the logs, but debugging messages can be set to be written to the log. Setting the DEFAULT_LOG_LEVEL variable in Log4J2Logger.java to </w:t>
-      </w:r>
-      <w:r>
-        <w:rPr>
-          <w:i/>
-        </w:rPr>
-        <w:t>LogLevel.DEBUG</w:t>
-      </w:r>
-      <w:r>
-        <w:t xml:space="preserve"> will allow debug messages to be written to the log files. The log files are written to a text document that can be found in the log/ subdirectory that is created where MASS is run. MASS will create a file for each node, so each node can be debugged separately.</w:t>
-      </w:r>
-    </w:p>
-    <w:p>
-      <w:r>
-        <w:t xml:space="preserve">The log files can be quite large and difficult to find useful information in them if the debug messages are set, so it is recommended to run the MASS application with a small </w:t>
-      </w:r>
-      <w:r>
-        <w:t>number</w:t>
-      </w:r>
-      <w:r>
-        <w:t xml:space="preserve"> of Places and Agents. Also, if the MASS application is being run somewhere with limited disk space, it is recommended to delete the log files or to move them somewhere else, otherwise Java will crash.</w:t>
-      </w:r>
-    </w:p>
-    <w:p>
-      <w:r>
-        <w:t xml:space="preserve">To debug the methods available to the user, the </w:t>
-      </w:r>
-      <w:r>
-        <w:rPr>
-          <w:i/>
-        </w:rPr>
-        <w:t>printOutput</w:t>
-      </w:r>
-      <w:r>
-        <w:t xml:space="preserve"> variable in MASS.java can be set too true. This will print status messages to the command line. </w:t>
-      </w:r>
-    </w:p>
-    <w:p>
-      <w:pPr>
-        <w:pStyle w:val="Heading1"/>
-      </w:pPr>
-      <w:bookmarkStart w:id="12" w:name="_Toc460327693"/>
-      <w:r>
-        <w:t>MASS Components</w:t>
-      </w:r>
-      <w:bookmarkEnd w:id="12"/>
-    </w:p>
-    <w:p>
-      <w:pPr>
-        <w:pStyle w:val="Heading2"/>
-      </w:pPr>
-      <w:bookmarkStart w:id="13" w:name="_Toc460327694"/>
+      <w:bookmarkStart w:id="13" w:name="_Toc465367251"/>
       <w:r>
         <w:t>Documentation</w:t>
       </w:r>
@@ -2226,7 +2702,15 @@
     </w:p>
     <w:p>
       <w:r>
-        <w:t xml:space="preserve">This project makes use of an automatic documentation generator called Javadocs. It is strongly encouraged to use this method of documentation to keep all the documentation standardized and easily accessible of anyone needing to learn about the methods and classes in this library. The generated documentation of the latest build can be found </w:t>
+        <w:t xml:space="preserve">This project makes use of an automatic documentation generator called </w:t>
+      </w:r>
+      <w:proofErr w:type="spellStart"/>
+      <w:r>
+        <w:t>Javadocs</w:t>
+      </w:r>
+      <w:proofErr w:type="spellEnd"/>
+      <w:r>
+        <w:t xml:space="preserve">. It is strongly encouraged to use this method of documentation to keep all the documentation standardized and easily accessible of anyone needing to learn about the methods and classes in this library. The generated documentation of the latest build can be found </w:t>
       </w:r>
       <w:hyperlink r:id="rId12" w:history="1">
         <w:r>
@@ -2281,8 +2765,16 @@
         <w:rPr>
           <w:b/>
         </w:rPr>
-        <w:t>@param</w:t>
-      </w:r>
+        <w:t>@</w:t>
+      </w:r>
+      <w:proofErr w:type="spellStart"/>
+      <w:r>
+        <w:rPr>
+          <w:b/>
+        </w:rPr>
+        <w:t>param</w:t>
+      </w:r>
+      <w:proofErr w:type="spellEnd"/>
       <w:r>
         <w:t xml:space="preserve"> </w:t>
       </w:r>
@@ -2310,8 +2802,13 @@
         </w:rPr>
         <w:tab/>
       </w:r>
-      <w:r>
-        <w:t>Describes a method parameter. One for each parameter.</w:t>
+      <w:proofErr w:type="gramStart"/>
+      <w:r>
+        <w:t>Describes</w:t>
+      </w:r>
+      <w:proofErr w:type="gramEnd"/>
+      <w:r>
+        <w:t xml:space="preserve"> a method parameter. One for each parameter.</w:t>
       </w:r>
     </w:p>
     <w:p>
@@ -2347,8 +2844,13 @@
         </w:rPr>
         <w:tab/>
       </w:r>
-      <w:r>
-        <w:t>Describes the return value.</w:t>
+      <w:proofErr w:type="gramStart"/>
+      <w:r>
+        <w:t>Describes</w:t>
+      </w:r>
+      <w:proofErr w:type="gramEnd"/>
+      <w:r>
+        <w:t xml:space="preserve"> the return value.</w:t>
       </w:r>
     </w:p>
     <w:p>
@@ -2365,11 +2867,19 @@
       <w:r>
         <w:t xml:space="preserve"> </w:t>
       </w:r>
-      <w:r>
-        <w:rPr>
-          <w:i/>
-        </w:rPr>
-        <w:t>classname description</w:t>
+      <w:proofErr w:type="spellStart"/>
+      <w:r>
+        <w:rPr>
+          <w:i/>
+        </w:rPr>
+        <w:t>classname</w:t>
+      </w:r>
+      <w:proofErr w:type="spellEnd"/>
+      <w:r>
+        <w:rPr>
+          <w:i/>
+        </w:rPr>
+        <w:t xml:space="preserve"> description</w:t>
       </w:r>
       <w:r>
         <w:rPr>
@@ -2377,8 +2887,13 @@
         </w:rPr>
         <w:tab/>
       </w:r>
-      <w:r>
-        <w:t>Describes an exception that may be thrown from this method.</w:t>
+      <w:proofErr w:type="gramStart"/>
+      <w:r>
+        <w:t>Describes</w:t>
+      </w:r>
+      <w:proofErr w:type="gramEnd"/>
+      <w:r>
+        <w:t xml:space="preserve"> an exception that may be thrown from this method.</w:t>
       </w:r>
     </w:p>
     <w:p>
@@ -2395,20 +2910,27 @@
       <w:r>
         <w:t xml:space="preserve"> </w:t>
       </w:r>
+      <w:proofErr w:type="spellStart"/>
       <w:r>
         <w:rPr>
           <w:i/>
         </w:rPr>
         <w:t>author_name</w:t>
       </w:r>
+      <w:proofErr w:type="spellEnd"/>
       <w:r>
         <w:rPr>
           <w:i/>
         </w:rPr>
         <w:tab/>
       </w:r>
-      <w:r>
-        <w:t>Describes an author</w:t>
+      <w:proofErr w:type="gramStart"/>
+      <w:r>
+        <w:t>Describes</w:t>
+      </w:r>
+      <w:proofErr w:type="gramEnd"/>
+      <w:r>
+        <w:t xml:space="preserve"> an author</w:t>
       </w:r>
     </w:p>
     <w:p>
@@ -2421,12 +2943,14 @@
         </w:rPr>
         <w:t xml:space="preserve">@version </w:t>
       </w:r>
+      <w:proofErr w:type="spellStart"/>
       <w:r>
         <w:rPr>
           <w:i/>
         </w:rPr>
         <w:t>version_number</w:t>
       </w:r>
+      <w:proofErr w:type="spellEnd"/>
       <w:r>
         <w:tab/>
         <w:t>Provides software version entry.</w:t>
@@ -2434,7 +2958,6 @@
     </w:p>
     <w:p>
       <w:r>
-        <w:lastRenderedPageBreak/>
         <w:t xml:space="preserve">This list is not all encompassing and a more complete list and guide can be found </w:t>
       </w:r>
       <w:hyperlink r:id="rId13" w:history="1">
@@ -2453,7 +2976,7 @@
       <w:pPr>
         <w:pStyle w:val="Heading2"/>
       </w:pPr>
-      <w:bookmarkStart w:id="14" w:name="_Toc460327695"/>
+      <w:bookmarkStart w:id="14" w:name="_Toc465367252"/>
       <w:r>
         <w:t>Debugger Package</w:t>
       </w:r>
@@ -2478,12 +3001,14 @@
       <w:r>
         <w:t xml:space="preserve"> but there are also classes contained in the package named </w:t>
       </w:r>
+      <w:proofErr w:type="spellStart"/>
       <w:r>
         <w:rPr>
           <w:i/>
         </w:rPr>
         <w:t>edu.uw.bothell.css.dsl.MASS.MassData</w:t>
       </w:r>
+      <w:proofErr w:type="spellEnd"/>
       <w:r>
         <w:t xml:space="preserve"> that are used to pass the information about the current state of the </w:t>
       </w:r>
@@ -2523,6 +3048,7 @@
       <w:r>
         <w:t xml:space="preserve">, and are the classes that are sent to the debugger. If these classes are changed without the changes being made in the debugger, a </w:t>
       </w:r>
+      <w:proofErr w:type="spellStart"/>
       <w:r>
         <w:rPr>
           <w:i/>
@@ -2541,15 +3067,18 @@
         </w:rPr>
         <w:t>eamCorruptedException</w:t>
       </w:r>
+      <w:proofErr w:type="spellEnd"/>
       <w:r>
         <w:t xml:space="preserve"> or an </w:t>
       </w:r>
+      <w:proofErr w:type="spellStart"/>
       <w:r>
         <w:rPr>
           <w:i/>
         </w:rPr>
         <w:t>InvalidClassException</w:t>
       </w:r>
+      <w:proofErr w:type="spellEnd"/>
       <w:r>
         <w:t xml:space="preserve"> can be thrown.</w:t>
       </w:r>
@@ -2558,7 +3087,7 @@
       <w:pPr>
         <w:pStyle w:val="Heading1"/>
       </w:pPr>
-      <w:bookmarkStart w:id="15" w:name="_Toc460327696"/>
+      <w:bookmarkStart w:id="15" w:name="_Toc465367253"/>
       <w:r>
         <w:t>Creating Applications for MASS</w:t>
       </w:r>
@@ -2568,7 +3097,7 @@
       <w:pPr>
         <w:pStyle w:val="Heading2"/>
       </w:pPr>
-      <w:bookmarkStart w:id="16" w:name="_Toc460327697"/>
+      <w:bookmarkStart w:id="16" w:name="_Toc465367254"/>
       <w:r>
         <w:t>Creating Applications</w:t>
       </w:r>
@@ -2611,14 +3140,80 @@
         </w:rPr>
         <w:t>$</w:t>
       </w:r>
+      <w:proofErr w:type="spellStart"/>
       <w:r>
         <w:rPr>
           <w:rFonts w:ascii="Consolas" w:hAnsi="Consolas" w:cs="Lucida Console"/>
           <w:sz w:val="20"/>
           <w:szCs w:val="20"/>
         </w:rPr>
-        <w:t>mvn archetype:generate -DarchetypeArtifactId=maven-archetype-quickstart</w:t>
-      </w:r>
+        <w:t>mvn</w:t>
+      </w:r>
+      <w:proofErr w:type="spellEnd"/>
+      <w:r>
+        <w:rPr>
+          <w:rFonts w:ascii="Consolas" w:hAnsi="Consolas" w:cs="Lucida Console"/>
+          <w:sz w:val="20"/>
+          <w:szCs w:val="20"/>
+        </w:rPr>
+        <w:t xml:space="preserve"> </w:t>
+      </w:r>
+      <w:proofErr w:type="spellStart"/>
+      <w:r>
+        <w:rPr>
+          <w:rFonts w:ascii="Consolas" w:hAnsi="Consolas" w:cs="Lucida Console"/>
+          <w:sz w:val="20"/>
+          <w:szCs w:val="20"/>
+        </w:rPr>
+        <w:t>archetype</w:t>
+      </w:r>
+      <w:proofErr w:type="gramStart"/>
+      <w:r>
+        <w:rPr>
+          <w:rFonts w:ascii="Consolas" w:hAnsi="Consolas" w:cs="Lucida Console"/>
+          <w:sz w:val="20"/>
+          <w:szCs w:val="20"/>
+        </w:rPr>
+        <w:t>:generate</w:t>
+      </w:r>
+      <w:proofErr w:type="spellEnd"/>
+      <w:proofErr w:type="gramEnd"/>
+      <w:r>
+        <w:rPr>
+          <w:rFonts w:ascii="Consolas" w:hAnsi="Consolas" w:cs="Lucida Console"/>
+          <w:sz w:val="20"/>
+          <w:szCs w:val="20"/>
+        </w:rPr>
+        <w:t xml:space="preserve"> -</w:t>
+      </w:r>
+      <w:proofErr w:type="spellStart"/>
+      <w:r>
+        <w:rPr>
+          <w:rFonts w:ascii="Consolas" w:hAnsi="Consolas" w:cs="Lucida Console"/>
+          <w:sz w:val="20"/>
+          <w:szCs w:val="20"/>
+        </w:rPr>
+        <w:t>DarchetypeArtifactId</w:t>
+      </w:r>
+      <w:proofErr w:type="spellEnd"/>
+      <w:r>
+        <w:rPr>
+          <w:rFonts w:ascii="Consolas" w:hAnsi="Consolas" w:cs="Lucida Console"/>
+          <w:sz w:val="20"/>
+          <w:szCs w:val="20"/>
+        </w:rPr>
+        <w:t>=maven-archetype-</w:t>
+      </w:r>
+      <w:proofErr w:type="spellStart"/>
+      <w:r>
+        <w:rPr>
+          <w:rFonts w:ascii="Consolas" w:hAnsi="Consolas" w:cs="Lucida Console"/>
+          <w:sz w:val="20"/>
+          <w:szCs w:val="20"/>
+        </w:rPr>
+        <w:t>quickstart</w:t>
+      </w:r>
+      <w:proofErr w:type="spellEnd"/>
     </w:p>
     <w:p>
       <w:pPr>
@@ -2629,25 +3224,36 @@
         </w:numPr>
       </w:pPr>
       <w:r>
+        <w:lastRenderedPageBreak/>
         <w:t xml:space="preserve">When prompted to enter </w:t>
       </w:r>
+      <w:proofErr w:type="spellStart"/>
       <w:r>
         <w:rPr>
           <w:i/>
         </w:rPr>
         <w:t>groupId</w:t>
       </w:r>
+      <w:proofErr w:type="spellEnd"/>
       <w:r>
         <w:t xml:space="preserve"> use</w:t>
       </w:r>
       <w:r>
         <w:t xml:space="preserve"> “</w:t>
       </w:r>
-      <w:r>
-        <w:rPr>
-          <w:i/>
-        </w:rPr>
-        <w:t xml:space="preserve">edu.uw.bothell.css.dsl.mass.apps” </w:t>
+      <w:proofErr w:type="spellStart"/>
+      <w:r>
+        <w:rPr>
+          <w:i/>
+        </w:rPr>
+        <w:t>edu.uw.bothell.css.dsl.mass.apps</w:t>
+      </w:r>
+      <w:proofErr w:type="spellEnd"/>
+      <w:r>
+        <w:rPr>
+          <w:i/>
+        </w:rPr>
+        <w:t xml:space="preserve">” </w:t>
       </w:r>
       <w:r>
         <w:t>without the quotes.</w:t>
@@ -2664,12 +3270,14 @@
       <w:r>
         <w:t xml:space="preserve">When prompted to enter </w:t>
       </w:r>
+      <w:proofErr w:type="spellStart"/>
       <w:r>
         <w:rPr>
           <w:i/>
         </w:rPr>
         <w:t>artifactId</w:t>
       </w:r>
+      <w:proofErr w:type="spellEnd"/>
       <w:r>
         <w:t xml:space="preserve">, enter the name of your application. This name should not contain spaces or periods; instead, use a hyphen for separating words e.g. </w:t>
       </w:r>
@@ -2781,12 +3389,14 @@
       <w:r>
         <w:t xml:space="preserve">When prompted to enter package name, the default package name is the same as the </w:t>
       </w:r>
+      <w:proofErr w:type="spellStart"/>
       <w:r>
         <w:rPr>
           <w:i/>
         </w:rPr>
         <w:t>groupId</w:t>
       </w:r>
+      <w:proofErr w:type="spellEnd"/>
       <w:r>
         <w:t>,</w:t>
       </w:r>
@@ -2887,7 +3497,91 @@
         <w:rPr>
           <w:i/>
         </w:rPr>
-        <w:t>/src/main/java/edu/uw/bothell/css/dsl/mass/apps/&lt;app name&gt;/</w:t>
+        <w:t>/</w:t>
+      </w:r>
+      <w:proofErr w:type="spellStart"/>
+      <w:r>
+        <w:rPr>
+          <w:i/>
+        </w:rPr>
+        <w:t>src</w:t>
+      </w:r>
+      <w:proofErr w:type="spellEnd"/>
+      <w:r>
+        <w:rPr>
+          <w:i/>
+        </w:rPr>
+        <w:t>/main/java/</w:t>
+      </w:r>
+      <w:proofErr w:type="spellStart"/>
+      <w:r>
+        <w:rPr>
+          <w:i/>
+        </w:rPr>
+        <w:t>edu</w:t>
+      </w:r>
+      <w:proofErr w:type="spellEnd"/>
+      <w:r>
+        <w:rPr>
+          <w:i/>
+        </w:rPr>
+        <w:t>/</w:t>
+      </w:r>
+      <w:proofErr w:type="spellStart"/>
+      <w:r>
+        <w:rPr>
+          <w:i/>
+        </w:rPr>
+        <w:t>uw</w:t>
+      </w:r>
+      <w:proofErr w:type="spellEnd"/>
+      <w:r>
+        <w:rPr>
+          <w:i/>
+        </w:rPr>
+        <w:t>/</w:t>
+      </w:r>
+      <w:proofErr w:type="spellStart"/>
+      <w:r>
+        <w:rPr>
+          <w:i/>
+        </w:rPr>
+        <w:t>bothell</w:t>
+      </w:r>
+      <w:proofErr w:type="spellEnd"/>
+      <w:r>
+        <w:rPr>
+          <w:i/>
+        </w:rPr>
+        <w:t>/</w:t>
+      </w:r>
+      <w:proofErr w:type="spellStart"/>
+      <w:r>
+        <w:rPr>
+          <w:i/>
+        </w:rPr>
+        <w:t>css</w:t>
+      </w:r>
+      <w:proofErr w:type="spellEnd"/>
+      <w:r>
+        <w:rPr>
+          <w:i/>
+        </w:rPr>
+        <w:t>/</w:t>
+      </w:r>
+      <w:proofErr w:type="spellStart"/>
+      <w:r>
+        <w:rPr>
+          <w:i/>
+        </w:rPr>
+        <w:t>dsl</w:t>
+      </w:r>
+      <w:proofErr w:type="spellEnd"/>
+      <w:r>
+        <w:rPr>
+          <w:i/>
+        </w:rPr>
+        <w:t>/mass/apps/&lt;app name&gt;/</w:t>
       </w:r>
       <w:r>
         <w:t>,</w:t>
@@ -2914,7 +3608,6 @@
         </w:numPr>
       </w:pPr>
       <w:r>
-        <w:lastRenderedPageBreak/>
         <w:t xml:space="preserve">Remove the </w:t>
       </w:r>
       <w:r>
@@ -2948,7 +3641,91 @@
         <w:rPr>
           <w:i/>
         </w:rPr>
-        <w:t>/src/test/java/edu/uw/bothell/css/dsl/mass/apps/&lt;app name&gt;/</w:t>
+        <w:t>/</w:t>
+      </w:r>
+      <w:proofErr w:type="spellStart"/>
+      <w:r>
+        <w:rPr>
+          <w:i/>
+        </w:rPr>
+        <w:t>src</w:t>
+      </w:r>
+      <w:proofErr w:type="spellEnd"/>
+      <w:r>
+        <w:rPr>
+          <w:i/>
+        </w:rPr>
+        <w:t>/test/java/</w:t>
+      </w:r>
+      <w:proofErr w:type="spellStart"/>
+      <w:r>
+        <w:rPr>
+          <w:i/>
+        </w:rPr>
+        <w:t>edu</w:t>
+      </w:r>
+      <w:proofErr w:type="spellEnd"/>
+      <w:r>
+        <w:rPr>
+          <w:i/>
+        </w:rPr>
+        <w:t>/</w:t>
+      </w:r>
+      <w:proofErr w:type="spellStart"/>
+      <w:r>
+        <w:rPr>
+          <w:i/>
+        </w:rPr>
+        <w:t>uw</w:t>
+      </w:r>
+      <w:proofErr w:type="spellEnd"/>
+      <w:r>
+        <w:rPr>
+          <w:i/>
+        </w:rPr>
+        <w:t>/</w:t>
+      </w:r>
+      <w:proofErr w:type="spellStart"/>
+      <w:r>
+        <w:rPr>
+          <w:i/>
+        </w:rPr>
+        <w:t>bothell</w:t>
+      </w:r>
+      <w:proofErr w:type="spellEnd"/>
+      <w:r>
+        <w:rPr>
+          <w:i/>
+        </w:rPr>
+        <w:t>/</w:t>
+      </w:r>
+      <w:proofErr w:type="spellStart"/>
+      <w:r>
+        <w:rPr>
+          <w:i/>
+        </w:rPr>
+        <w:t>css</w:t>
+      </w:r>
+      <w:proofErr w:type="spellEnd"/>
+      <w:r>
+        <w:rPr>
+          <w:i/>
+        </w:rPr>
+        <w:t>/</w:t>
+      </w:r>
+      <w:proofErr w:type="spellStart"/>
+      <w:r>
+        <w:rPr>
+          <w:i/>
+        </w:rPr>
+        <w:t>dsl</w:t>
+      </w:r>
+      <w:proofErr w:type="spellEnd"/>
+      <w:r>
+        <w:rPr>
+          <w:i/>
+        </w:rPr>
+        <w:t>/mass/apps/&lt;app name&gt;/</w:t>
       </w:r>
       <w:r>
         <w:t xml:space="preserve"> directory.</w:t>
@@ -2999,7 +3776,21 @@
         <w:rPr>
           <w:i/>
         </w:rPr>
-        <w:t xml:space="preserve">&lt;artifactId&gt; </w:t>
+        <w:t>&lt;</w:t>
+      </w:r>
+      <w:proofErr w:type="spellStart"/>
+      <w:r>
+        <w:rPr>
+          <w:i/>
+        </w:rPr>
+        <w:t>artifactId</w:t>
+      </w:r>
+      <w:proofErr w:type="spellEnd"/>
+      <w:r>
+        <w:rPr>
+          <w:i/>
+        </w:rPr>
+        <w:t xml:space="preserve">&gt; </w:t>
       </w:r>
       <w:r>
         <w:t xml:space="preserve">element which is not inside the </w:t>
@@ -3080,7 +3871,23 @@
         <w:rPr>
           <w:i/>
         </w:rPr>
-        <w:t>&lt;url&gt;</w:t>
+        <w:t>&lt;</w:t>
+      </w:r>
+      <w:proofErr w:type="spellStart"/>
+      <w:proofErr w:type="gramStart"/>
+      <w:r>
+        <w:rPr>
+          <w:i/>
+        </w:rPr>
+        <w:t>url</w:t>
+      </w:r>
+      <w:proofErr w:type="spellEnd"/>
+      <w:proofErr w:type="gramEnd"/>
+      <w:r>
+        <w:rPr>
+          <w:i/>
+        </w:rPr>
+        <w:t>&gt;</w:t>
       </w:r>
       <w:r>
         <w:t xml:space="preserve"> element.</w:t>
@@ -3140,7 +3947,61 @@
           <w:sz w:val="17"/>
           <w:szCs w:val="17"/>
         </w:rPr>
-        <w:t>&lt;groupId&gt;junit&lt;/groupId&gt;</w:t>
+        <w:t>&lt;</w:t>
+      </w:r>
+      <w:proofErr w:type="spellStart"/>
+      <w:r>
+        <w:rPr>
+          <w:rFonts w:ascii="Courier New" w:hAnsi="Courier New" w:cs="Courier New"/>
+          <w:sz w:val="17"/>
+          <w:szCs w:val="17"/>
+        </w:rPr>
+        <w:t>groupId</w:t>
+      </w:r>
+      <w:proofErr w:type="spellEnd"/>
+      <w:r>
+        <w:rPr>
+          <w:rFonts w:ascii="Courier New" w:hAnsi="Courier New" w:cs="Courier New"/>
+          <w:sz w:val="17"/>
+          <w:szCs w:val="17"/>
+        </w:rPr>
+        <w:t>&gt;</w:t>
+      </w:r>
+      <w:proofErr w:type="spellStart"/>
+      <w:r>
+        <w:rPr>
+          <w:rFonts w:ascii="Courier New" w:hAnsi="Courier New" w:cs="Courier New"/>
+          <w:sz w:val="17"/>
+          <w:szCs w:val="17"/>
+        </w:rPr>
+        <w:t>junit</w:t>
+      </w:r>
+      <w:proofErr w:type="spellEnd"/>
+      <w:r>
+        <w:rPr>
+          <w:rFonts w:ascii="Courier New" w:hAnsi="Courier New" w:cs="Courier New"/>
+          <w:sz w:val="17"/>
+          <w:szCs w:val="17"/>
+        </w:rPr>
+        <w:t>&lt;/</w:t>
+      </w:r>
+      <w:proofErr w:type="spellStart"/>
+      <w:r>
+        <w:rPr>
+          <w:rFonts w:ascii="Courier New" w:hAnsi="Courier New" w:cs="Courier New"/>
+          <w:sz w:val="17"/>
+          <w:szCs w:val="17"/>
+        </w:rPr>
+        <w:t>groupId</w:t>
+      </w:r>
+      <w:proofErr w:type="spellEnd"/>
+      <w:r>
+        <w:rPr>
+          <w:rFonts w:ascii="Courier New" w:hAnsi="Courier New" w:cs="Courier New"/>
+          <w:sz w:val="17"/>
+          <w:szCs w:val="17"/>
+        </w:rPr>
+        <w:t>&gt;</w:t>
       </w:r>
     </w:p>
     <w:p>
@@ -3163,7 +4024,61 @@
           <w:sz w:val="17"/>
           <w:szCs w:val="17"/>
         </w:rPr>
-        <w:t>&lt;artifactId&gt;junit&lt;/artifactId&gt;</w:t>
+        <w:t>&lt;</w:t>
+      </w:r>
+      <w:proofErr w:type="spellStart"/>
+      <w:r>
+        <w:rPr>
+          <w:rFonts w:ascii="Courier New" w:hAnsi="Courier New" w:cs="Courier New"/>
+          <w:sz w:val="17"/>
+          <w:szCs w:val="17"/>
+        </w:rPr>
+        <w:t>artifactId</w:t>
+      </w:r>
+      <w:proofErr w:type="spellEnd"/>
+      <w:r>
+        <w:rPr>
+          <w:rFonts w:ascii="Courier New" w:hAnsi="Courier New" w:cs="Courier New"/>
+          <w:sz w:val="17"/>
+          <w:szCs w:val="17"/>
+        </w:rPr>
+        <w:t>&gt;</w:t>
+      </w:r>
+      <w:proofErr w:type="spellStart"/>
+      <w:r>
+        <w:rPr>
+          <w:rFonts w:ascii="Courier New" w:hAnsi="Courier New" w:cs="Courier New"/>
+          <w:sz w:val="17"/>
+          <w:szCs w:val="17"/>
+        </w:rPr>
+        <w:t>junit</w:t>
+      </w:r>
+      <w:proofErr w:type="spellEnd"/>
+      <w:r>
+        <w:rPr>
+          <w:rFonts w:ascii="Courier New" w:hAnsi="Courier New" w:cs="Courier New"/>
+          <w:sz w:val="17"/>
+          <w:szCs w:val="17"/>
+        </w:rPr>
+        <w:t>&lt;/</w:t>
+      </w:r>
+      <w:proofErr w:type="spellStart"/>
+      <w:r>
+        <w:rPr>
+          <w:rFonts w:ascii="Courier New" w:hAnsi="Courier New" w:cs="Courier New"/>
+          <w:sz w:val="17"/>
+          <w:szCs w:val="17"/>
+        </w:rPr>
+        <w:t>artifactId</w:t>
+      </w:r>
+      <w:proofErr w:type="spellEnd"/>
+      <w:r>
+        <w:rPr>
+          <w:rFonts w:ascii="Courier New" w:hAnsi="Courier New" w:cs="Courier New"/>
+          <w:sz w:val="17"/>
+          <w:szCs w:val="17"/>
+        </w:rPr>
+        <w:t>&gt;</w:t>
       </w:r>
     </w:p>
     <w:p>
@@ -3252,7 +4167,15 @@
         <w:t>&lt;/project&gt;</w:t>
       </w:r>
       <w:r>
-        <w:t xml:space="preserve"> element.</w:t>
+        <w:t xml:space="preserve"> element, making sure to set the value for “</w:t>
+      </w:r>
+      <w:proofErr w:type="spellStart"/>
+      <w:r>
+        <w:t>mainClass</w:t>
+      </w:r>
+      <w:proofErr w:type="spellEnd"/>
+      <w:r>
+        <w:t>” as appropriate for your application:</w:t>
       </w:r>
     </w:p>
     <w:p>
@@ -3343,8 +4266,27 @@
           <w:sz w:val="17"/>
           <w:szCs w:val="17"/>
         </w:rPr>
-        <w:t>&lt;groupId&gt;</w:t>
-      </w:r>
+        <w:t>&lt;</w:t>
+      </w:r>
+      <w:proofErr w:type="spellStart"/>
+      <w:r>
+        <w:rPr>
+          <w:rFonts w:ascii="Courier New" w:hAnsi="Courier New" w:cs="Courier New"/>
+          <w:sz w:val="17"/>
+          <w:szCs w:val="17"/>
+        </w:rPr>
+        <w:t>groupId</w:t>
+      </w:r>
+      <w:proofErr w:type="spellEnd"/>
+      <w:r>
+        <w:rPr>
+          <w:rFonts w:ascii="Courier New" w:hAnsi="Courier New" w:cs="Courier New"/>
+          <w:sz w:val="17"/>
+          <w:szCs w:val="17"/>
+        </w:rPr>
+        <w:t>&gt;</w:t>
+      </w:r>
+      <w:proofErr w:type="spellStart"/>
       <w:r>
         <w:rPr>
           <w:rFonts w:ascii="Courier New" w:hAnsi="Courier New" w:cs="Courier New"/>
@@ -3353,13 +4295,32 @@
         </w:rPr>
         <w:t>org.apache.maven.plugins</w:t>
       </w:r>
-      <w:r>
-        <w:rPr>
-          <w:rFonts w:ascii="Courier New" w:hAnsi="Courier New" w:cs="Courier New"/>
-          <w:sz w:val="17"/>
-          <w:szCs w:val="17"/>
-        </w:rPr>
-        <w:t>&lt;/groupId&gt;</w:t>
+      <w:proofErr w:type="spellEnd"/>
+      <w:r>
+        <w:rPr>
+          <w:rFonts w:ascii="Courier New" w:hAnsi="Courier New" w:cs="Courier New"/>
+          <w:sz w:val="17"/>
+          <w:szCs w:val="17"/>
+        </w:rPr>
+        <w:t>&lt;/</w:t>
+      </w:r>
+      <w:proofErr w:type="spellStart"/>
+      <w:r>
+        <w:rPr>
+          <w:rFonts w:ascii="Courier New" w:hAnsi="Courier New" w:cs="Courier New"/>
+          <w:sz w:val="17"/>
+          <w:szCs w:val="17"/>
+        </w:rPr>
+        <w:t>groupId</w:t>
+      </w:r>
+      <w:proofErr w:type="spellEnd"/>
+      <w:r>
+        <w:rPr>
+          <w:rFonts w:ascii="Courier New" w:hAnsi="Courier New" w:cs="Courier New"/>
+          <w:sz w:val="17"/>
+          <w:szCs w:val="17"/>
+        </w:rPr>
+        <w:t>&gt;</w:t>
       </w:r>
     </w:p>
     <w:p>
@@ -3382,23 +4343,77 @@
           <w:sz w:val="17"/>
           <w:szCs w:val="17"/>
         </w:rPr>
-        <w:t>&lt;artifactId&gt;</w:t>
-      </w:r>
-      <w:r>
-        <w:rPr>
-          <w:rFonts w:ascii="Courier New" w:hAnsi="Courier New" w:cs="Courier New"/>
-          <w:sz w:val="17"/>
-          <w:szCs w:val="17"/>
-        </w:rPr>
-        <w:t>maven-javadoc-plugin</w:t>
-      </w:r>
-      <w:r>
-        <w:rPr>
-          <w:rFonts w:ascii="Courier New" w:hAnsi="Courier New" w:cs="Courier New"/>
-          <w:sz w:val="17"/>
-          <w:szCs w:val="17"/>
-        </w:rPr>
-        <w:t>&lt;/artifactId&gt;</w:t>
+        <w:t>&lt;</w:t>
+      </w:r>
+      <w:proofErr w:type="spellStart"/>
+      <w:r>
+        <w:rPr>
+          <w:rFonts w:ascii="Courier New" w:hAnsi="Courier New" w:cs="Courier New"/>
+          <w:sz w:val="17"/>
+          <w:szCs w:val="17"/>
+        </w:rPr>
+        <w:t>artifactId</w:t>
+      </w:r>
+      <w:proofErr w:type="spellEnd"/>
+      <w:r>
+        <w:rPr>
+          <w:rFonts w:ascii="Courier New" w:hAnsi="Courier New" w:cs="Courier New"/>
+          <w:sz w:val="17"/>
+          <w:szCs w:val="17"/>
+        </w:rPr>
+        <w:t>&gt;</w:t>
+      </w:r>
+      <w:r>
+        <w:rPr>
+          <w:rFonts w:ascii="Courier New" w:hAnsi="Courier New" w:cs="Courier New"/>
+          <w:sz w:val="17"/>
+          <w:szCs w:val="17"/>
+        </w:rPr>
+        <w:t>maven-</w:t>
+      </w:r>
+      <w:proofErr w:type="spellStart"/>
+      <w:r>
+        <w:rPr>
+          <w:rFonts w:ascii="Courier New" w:hAnsi="Courier New" w:cs="Courier New"/>
+          <w:sz w:val="17"/>
+          <w:szCs w:val="17"/>
+        </w:rPr>
+        <w:t>javadoc</w:t>
+      </w:r>
+      <w:proofErr w:type="spellEnd"/>
+      <w:r>
+        <w:rPr>
+          <w:rFonts w:ascii="Courier New" w:hAnsi="Courier New" w:cs="Courier New"/>
+          <w:sz w:val="17"/>
+          <w:szCs w:val="17"/>
+        </w:rPr>
+        <w:t>-plugin</w:t>
+      </w:r>
+      <w:r>
+        <w:rPr>
+          <w:rFonts w:ascii="Courier New" w:hAnsi="Courier New" w:cs="Courier New"/>
+          <w:sz w:val="17"/>
+          <w:szCs w:val="17"/>
+        </w:rPr>
+        <w:t>&lt;/</w:t>
+      </w:r>
+      <w:proofErr w:type="spellStart"/>
+      <w:r>
+        <w:rPr>
+          <w:rFonts w:ascii="Courier New" w:hAnsi="Courier New" w:cs="Courier New"/>
+          <w:sz w:val="17"/>
+          <w:szCs w:val="17"/>
+        </w:rPr>
+        <w:t>artifactId</w:t>
+      </w:r>
+      <w:proofErr w:type="spellEnd"/>
+      <w:r>
+        <w:rPr>
+          <w:rFonts w:ascii="Courier New" w:hAnsi="Courier New" w:cs="Courier New"/>
+          <w:sz w:val="17"/>
+          <w:szCs w:val="17"/>
+        </w:rPr>
+        <w:t>&gt;</w:t>
       </w:r>
     </w:p>
     <w:p>
@@ -3467,7 +4482,25 @@
           <w:sz w:val="17"/>
           <w:szCs w:val="17"/>
         </w:rPr>
-        <w:t>&lt;artifactId&gt;</w:t>
+        <w:t>&lt;</w:t>
+      </w:r>
+      <w:proofErr w:type="spellStart"/>
+      <w:r>
+        <w:rPr>
+          <w:rFonts w:ascii="Courier New" w:hAnsi="Courier New" w:cs="Courier New"/>
+          <w:sz w:val="17"/>
+          <w:szCs w:val="17"/>
+        </w:rPr>
+        <w:t>artifactId</w:t>
+      </w:r>
+      <w:proofErr w:type="spellEnd"/>
+      <w:r>
+        <w:rPr>
+          <w:rFonts w:ascii="Courier New" w:hAnsi="Courier New" w:cs="Courier New"/>
+          <w:sz w:val="17"/>
+          <w:szCs w:val="17"/>
+        </w:rPr>
+        <w:t>&gt;</w:t>
       </w:r>
       <w:r>
         <w:rPr>
@@ -3483,7 +4516,25 @@
           <w:sz w:val="17"/>
           <w:szCs w:val="17"/>
         </w:rPr>
-        <w:t>&lt;/artifactId&gt;</w:t>
+        <w:t>&lt;/</w:t>
+      </w:r>
+      <w:proofErr w:type="spellStart"/>
+      <w:r>
+        <w:rPr>
+          <w:rFonts w:ascii="Courier New" w:hAnsi="Courier New" w:cs="Courier New"/>
+          <w:sz w:val="17"/>
+          <w:szCs w:val="17"/>
+        </w:rPr>
+        <w:t>artifactId</w:t>
+      </w:r>
+      <w:proofErr w:type="spellEnd"/>
+      <w:r>
+        <w:rPr>
+          <w:rFonts w:ascii="Courier New" w:hAnsi="Courier New" w:cs="Courier New"/>
+          <w:sz w:val="17"/>
+          <w:szCs w:val="17"/>
+        </w:rPr>
+        <w:t>&gt;</w:t>
       </w:r>
     </w:p>
     <w:p>
@@ -3529,6 +4580,7 @@
           <w:sz w:val="17"/>
           <w:szCs w:val="17"/>
         </w:rPr>
+        <w:lastRenderedPageBreak/>
         <w:t>&lt;archive&gt;</w:t>
       </w:r>
     </w:p>
@@ -3575,15 +4627,45 @@
           <w:sz w:val="17"/>
           <w:szCs w:val="17"/>
         </w:rPr>
-        <w:t>&lt;mainClass&gt;</w:t>
-      </w:r>
-      <w:r>
-        <w:rPr>
-          <w:rFonts w:ascii="Courier New" w:hAnsi="Courier New" w:cs="Courier New"/>
-          <w:sz w:val="17"/>
-          <w:szCs w:val="17"/>
-        </w:rPr>
-        <w:t>edu.uw.bothell.css.dsl.mass.apps.</w:t>
+        <w:t>&lt;</w:t>
+      </w:r>
+      <w:proofErr w:type="spellStart"/>
+      <w:proofErr w:type="gramStart"/>
+      <w:r>
+        <w:rPr>
+          <w:rFonts w:ascii="Courier New" w:hAnsi="Courier New" w:cs="Courier New"/>
+          <w:sz w:val="17"/>
+          <w:szCs w:val="17"/>
+        </w:rPr>
+        <w:t>mainClass</w:t>
+      </w:r>
+      <w:proofErr w:type="spellEnd"/>
+      <w:r>
+        <w:rPr>
+          <w:rFonts w:ascii="Courier New" w:hAnsi="Courier New" w:cs="Courier New"/>
+          <w:sz w:val="17"/>
+          <w:szCs w:val="17"/>
+        </w:rPr>
+        <w:t>&gt;</w:t>
+      </w:r>
+      <w:proofErr w:type="spellStart"/>
+      <w:proofErr w:type="gramEnd"/>
+      <w:r>
+        <w:rPr>
+          <w:rFonts w:ascii="Courier New" w:hAnsi="Courier New" w:cs="Courier New"/>
+          <w:sz w:val="17"/>
+          <w:szCs w:val="17"/>
+        </w:rPr>
+        <w:t>edu.uw.bothell.css.dsl.mass.apps</w:t>
+      </w:r>
+      <w:proofErr w:type="spellEnd"/>
+      <w:r>
+        <w:rPr>
+          <w:rFonts w:ascii="Courier New" w:hAnsi="Courier New" w:cs="Courier New"/>
+          <w:sz w:val="17"/>
+          <w:szCs w:val="17"/>
+        </w:rPr>
+        <w:t>.</w:t>
       </w:r>
     </w:p>
     <w:p>
@@ -3614,7 +4696,25 @@
           <w:sz w:val="17"/>
           <w:szCs w:val="17"/>
         </w:rPr>
-        <w:t>&lt;/mainClass&gt;</w:t>
+        <w:t>&lt;/</w:t>
+      </w:r>
+      <w:proofErr w:type="spellStart"/>
+      <w:r>
+        <w:rPr>
+          <w:rFonts w:ascii="Courier New" w:hAnsi="Courier New" w:cs="Courier New"/>
+          <w:sz w:val="17"/>
+          <w:szCs w:val="17"/>
+        </w:rPr>
+        <w:t>mainClass</w:t>
+      </w:r>
+      <w:proofErr w:type="spellEnd"/>
+      <w:r>
+        <w:rPr>
+          <w:rFonts w:ascii="Courier New" w:hAnsi="Courier New" w:cs="Courier New"/>
+          <w:sz w:val="17"/>
+          <w:szCs w:val="17"/>
+        </w:rPr>
+        <w:t>&gt;</w:t>
       </w:r>
     </w:p>
     <w:p>
@@ -3765,7 +4865,29 @@
         <w:rPr>
           <w:i/>
         </w:rPr>
-        <w:t xml:space="preserve">package edu.uw.bothell.css.dsl.mass.apps.(project package); </w:t>
+        <w:t xml:space="preserve">package </w:t>
+      </w:r>
+      <w:proofErr w:type="spellStart"/>
+      <w:r>
+        <w:rPr>
+          <w:i/>
+        </w:rPr>
+        <w:t>edu.uw.bothell.css.dsl.mass.apps</w:t>
+      </w:r>
+      <w:proofErr w:type="spellEnd"/>
+      <w:proofErr w:type="gramStart"/>
+      <w:r>
+        <w:rPr>
+          <w:i/>
+        </w:rPr>
+        <w:t>.(</w:t>
+      </w:r>
+      <w:proofErr w:type="gramEnd"/>
+      <w:r>
+        <w:rPr>
+          <w:i/>
+        </w:rPr>
+        <w:t xml:space="preserve">project package); </w:t>
       </w:r>
       <w:r>
         <w:t xml:space="preserve">to each source file. When declaring </w:t>
@@ -3792,17 +4914,47 @@
         <w:rPr>
           <w:i/>
         </w:rPr>
-        <w:t>(class name).class.getName()</w:t>
-      </w:r>
-      <w:r>
-        <w:t xml:space="preserve"> in the className field. </w:t>
+        <w:t>(class name).</w:t>
+      </w:r>
+      <w:proofErr w:type="spellStart"/>
+      <w:proofErr w:type="gramStart"/>
+      <w:r>
+        <w:rPr>
+          <w:i/>
+        </w:rPr>
+        <w:t>class.getName</w:t>
+      </w:r>
+      <w:proofErr w:type="spellEnd"/>
+      <w:r>
+        <w:rPr>
+          <w:i/>
+        </w:rPr>
+        <w:t>(</w:t>
+      </w:r>
+      <w:proofErr w:type="gramEnd"/>
+      <w:r>
+        <w:rPr>
+          <w:i/>
+        </w:rPr>
+        <w:t>)</w:t>
+      </w:r>
+      <w:r>
+        <w:t xml:space="preserve"> in the </w:t>
+      </w:r>
+      <w:proofErr w:type="spellStart"/>
+      <w:r>
+        <w:t>className</w:t>
+      </w:r>
+      <w:proofErr w:type="spellEnd"/>
+      <w:r>
+        <w:t xml:space="preserve"> field. </w:t>
       </w:r>
     </w:p>
     <w:p>
       <w:pPr>
         <w:pStyle w:val="Heading2"/>
       </w:pPr>
-      <w:bookmarkStart w:id="17" w:name="_Toc460327698"/>
+      <w:bookmarkStart w:id="17" w:name="_Toc465367255"/>
       <w:r>
         <w:t>Compiling Applications</w:t>
       </w:r>
@@ -3847,14 +4999,30 @@
           <w:rFonts w:ascii="Consolas" w:hAnsi="Consolas"/>
           <w:sz w:val="20"/>
         </w:rPr>
-        <w:t>$mvn package</w:t>
+        <w:t>$</w:t>
+      </w:r>
+      <w:proofErr w:type="spellStart"/>
+      <w:r>
+        <w:rPr>
+          <w:rFonts w:ascii="Consolas" w:hAnsi="Consolas"/>
+          <w:sz w:val="20"/>
+        </w:rPr>
+        <w:t>mvn</w:t>
+      </w:r>
+      <w:proofErr w:type="spellEnd"/>
+      <w:r>
+        <w:rPr>
+          <w:rFonts w:ascii="Consolas" w:hAnsi="Consolas"/>
+          <w:sz w:val="20"/>
+        </w:rPr>
+        <w:t xml:space="preserve"> package</w:t>
       </w:r>
     </w:p>
     <w:p>
       <w:pPr>
         <w:pStyle w:val="Heading2"/>
       </w:pPr>
-      <w:bookmarkStart w:id="18" w:name="_Toc460327699"/>
+      <w:bookmarkStart w:id="18" w:name="_Toc465367256"/>
       <w:r>
         <w:t>Running Applications</w:t>
       </w:r>
@@ -3871,11 +5039,7 @@
         <w:t>nodes.xml</w:t>
       </w:r>
       <w:r>
-        <w:t xml:space="preserve">, in the same directory you are running the application from for MASS to run. This file is an XML document that passes information about the computing nodes you wish to be using to run your MASS </w:t>
-      </w:r>
-      <w:r>
-        <w:lastRenderedPageBreak/>
-        <w:t>application on. If you do not have this file, MASS will not initialize causing your application to fail. An example of this file is shown in the code sample below.</w:t>
+        <w:t>, in the same directory you are running the application from for MASS to run. This file is an XML document that passes information about the computing nodes you wish to be using to run your MASS application on. If you do not have this file, MASS will not initialize causing your application to fail. An example of this file is shown in the code sample below.</w:t>
       </w:r>
     </w:p>
     <w:p>
@@ -3950,7 +5114,31 @@
         <w:contextualSpacing/>
       </w:pPr>
       <w:r>
-        <w:t>&lt;javahome&gt;/usr/bin/&lt;/javahome&gt;</w:t>
+        <w:t>&lt;</w:t>
+      </w:r>
+      <w:proofErr w:type="spellStart"/>
+      <w:r>
+        <w:t>javahome</w:t>
+      </w:r>
+      <w:proofErr w:type="spellEnd"/>
+      <w:r>
+        <w:t>&gt;/</w:t>
+      </w:r>
+      <w:proofErr w:type="spellStart"/>
+      <w:r>
+        <w:t>usr</w:t>
+      </w:r>
+      <w:proofErr w:type="spellEnd"/>
+      <w:r>
+        <w:t>/bin/&lt;/</w:t>
+      </w:r>
+      <w:proofErr w:type="spellStart"/>
+      <w:r>
+        <w:t>javahome</w:t>
+      </w:r>
+      <w:proofErr w:type="spellEnd"/>
+      <w:r>
+        <w:t>&gt;</w:t>
       </w:r>
     </w:p>
     <w:p>
@@ -3965,7 +5153,31 @@
         <w:contextualSpacing/>
       </w:pPr>
       <w:r>
-        <w:t>&lt;masshome&gt;~/MASS_Application/&lt;/masshome&gt;</w:t>
+        <w:t>&lt;</w:t>
+      </w:r>
+      <w:proofErr w:type="spellStart"/>
+      <w:r>
+        <w:t>masshome</w:t>
+      </w:r>
+      <w:proofErr w:type="spellEnd"/>
+      <w:r>
+        <w:t>&gt;~/</w:t>
+      </w:r>
+      <w:proofErr w:type="spellStart"/>
+      <w:r>
+        <w:t>MASS_Application</w:t>
+      </w:r>
+      <w:proofErr w:type="spellEnd"/>
+      <w:r>
+        <w:t>/&lt;/</w:t>
+      </w:r>
+      <w:proofErr w:type="spellStart"/>
+      <w:r>
+        <w:t>masshome</w:t>
+      </w:r>
+      <w:proofErr w:type="spellEnd"/>
+      <w:r>
+        <w:t>&gt;</w:t>
       </w:r>
     </w:p>
     <w:p>
@@ -3997,21 +5209,38 @@
       <w:r>
         <w:t>&lt;</w:t>
       </w:r>
+      <w:proofErr w:type="spellStart"/>
       <w:r>
         <w:t>privatekey</w:t>
       </w:r>
+      <w:proofErr w:type="spellEnd"/>
       <w:r>
         <w:t>&gt;</w:t>
       </w:r>
       <w:r>
-        <w:t>~/.ssh/id_rsa</w:t>
-      </w:r>
+        <w:t>~/.</w:t>
+      </w:r>
+      <w:proofErr w:type="spellStart"/>
+      <w:r>
+        <w:t>ssh</w:t>
+      </w:r>
+      <w:proofErr w:type="spellEnd"/>
+      <w:r>
+        <w:t>/</w:t>
+      </w:r>
+      <w:proofErr w:type="spellStart"/>
+      <w:r>
+        <w:t>id_rsa</w:t>
+      </w:r>
+      <w:proofErr w:type="spellEnd"/>
       <w:r>
         <w:t>&lt;/</w:t>
       </w:r>
+      <w:proofErr w:type="spellStart"/>
       <w:r>
         <w:t>privatekey</w:t>
       </w:r>
+      <w:proofErr w:type="spellEnd"/>
       <w:r>
         <w:t>&gt;</w:t>
       </w:r>
@@ -4073,7 +5302,31 @@
         <w:contextualSpacing/>
       </w:pPr>
       <w:r>
-        <w:t>&lt;javahome&gt;/usr/bin/&lt;/javahome&gt;</w:t>
+        <w:t>&lt;</w:t>
+      </w:r>
+      <w:proofErr w:type="spellStart"/>
+      <w:r>
+        <w:t>javahome</w:t>
+      </w:r>
+      <w:proofErr w:type="spellEnd"/>
+      <w:r>
+        <w:t>&gt;/</w:t>
+      </w:r>
+      <w:proofErr w:type="spellStart"/>
+      <w:r>
+        <w:t>usr</w:t>
+      </w:r>
+      <w:proofErr w:type="spellEnd"/>
+      <w:r>
+        <w:t>/bin/&lt;/</w:t>
+      </w:r>
+      <w:proofErr w:type="spellStart"/>
+      <w:r>
+        <w:t>javahome</w:t>
+      </w:r>
+      <w:proofErr w:type="spellEnd"/>
+      <w:r>
+        <w:t>&gt;</w:t>
       </w:r>
     </w:p>
     <w:p>
@@ -4088,7 +5341,31 @@
         <w:contextualSpacing/>
       </w:pPr>
       <w:r>
-        <w:t>&lt;masshome&gt;~/MASS_Application/&lt;/masshome&gt;</w:t>
+        <w:t>&lt;</w:t>
+      </w:r>
+      <w:proofErr w:type="spellStart"/>
+      <w:r>
+        <w:t>masshome</w:t>
+      </w:r>
+      <w:proofErr w:type="spellEnd"/>
+      <w:r>
+        <w:t>&gt;~/</w:t>
+      </w:r>
+      <w:proofErr w:type="spellStart"/>
+      <w:r>
+        <w:t>MASS_Application</w:t>
+      </w:r>
+      <w:proofErr w:type="spellEnd"/>
+      <w:r>
+        <w:t>/&lt;/</w:t>
+      </w:r>
+      <w:proofErr w:type="spellStart"/>
+      <w:r>
+        <w:t>masshome</w:t>
+      </w:r>
+      <w:proofErr w:type="spellEnd"/>
+      <w:r>
+        <w:t>&gt;</w:t>
       </w:r>
     </w:p>
     <w:p>
@@ -4120,21 +5397,38 @@
       <w:r>
         <w:t>&lt;</w:t>
       </w:r>
+      <w:proofErr w:type="spellStart"/>
       <w:r>
         <w:t>privatekey</w:t>
       </w:r>
+      <w:proofErr w:type="spellEnd"/>
       <w:r>
         <w:t xml:space="preserve"> &gt;</w:t>
       </w:r>
       <w:r>
-        <w:t>~/.ssh/id_rsa</w:t>
-      </w:r>
+        <w:t>~/.</w:t>
+      </w:r>
+      <w:proofErr w:type="spellStart"/>
+      <w:r>
+        <w:t>ssh</w:t>
+      </w:r>
+      <w:proofErr w:type="spellEnd"/>
+      <w:r>
+        <w:t>/</w:t>
+      </w:r>
+      <w:proofErr w:type="spellStart"/>
+      <w:r>
+        <w:t>id_rsa</w:t>
+      </w:r>
+      <w:proofErr w:type="spellEnd"/>
       <w:r>
         <w:t>&lt;/</w:t>
       </w:r>
+      <w:proofErr w:type="spellStart"/>
       <w:r>
         <w:t>privatekey</w:t>
       </w:r>
+      <w:proofErr w:type="spellEnd"/>
       <w:r>
         <w:t xml:space="preserve"> &gt;</w:t>
       </w:r>
@@ -4183,7 +5477,21 @@
         <w:rPr>
           <w:b/>
         </w:rPr>
-        <w:t>&lt;nodes&gt;</w:t>
+        <w:t>&lt;</w:t>
+      </w:r>
+      <w:proofErr w:type="gramStart"/>
+      <w:r>
+        <w:rPr>
+          <w:b/>
+        </w:rPr>
+        <w:t>nodes</w:t>
+      </w:r>
+      <w:proofErr w:type="gramEnd"/>
+      <w:r>
+        <w:rPr>
+          <w:b/>
+        </w:rPr>
+        <w:t>&gt;</w:t>
       </w:r>
       <w:r>
         <w:rPr>
@@ -4204,16 +5512,34 @@
         <w:rPr>
           <w:b/>
         </w:rPr>
-        <w:t>&lt;node&gt;</w:t>
-      </w:r>
+        <w:t>&lt;</w:t>
+      </w:r>
+      <w:proofErr w:type="gramStart"/>
       <w:r>
         <w:rPr>
           <w:b/>
         </w:rPr>
+        <w:t>node</w:t>
+      </w:r>
+      <w:proofErr w:type="gramEnd"/>
+      <w:r>
+        <w:rPr>
+          <w:b/>
+        </w:rPr>
+        <w:t>&gt;</w:t>
+      </w:r>
+      <w:r>
+        <w:rPr>
+          <w:b/>
+        </w:rPr>
         <w:tab/>
       </w:r>
       <w:r>
-        <w:t xml:space="preserve">This element contains information about a specific node that the MASS application will run on. The number of these elements will determine how many computing nodes will be used i.e. if there were eight </w:t>
+        <w:t xml:space="preserve">This element contains information about a specific node that the MASS application will run on. The number of these elements will determine how </w:t>
+      </w:r>
+      <w:r>
+        <w:lastRenderedPageBreak/>
+        <w:t xml:space="preserve">many computing nodes will be used i.e. if there were eight </w:t>
       </w:r>
       <w:r>
         <w:rPr>
@@ -4234,16 +5560,38 @@
         <w:rPr>
           <w:b/>
         </w:rPr>
-        <w:t>&lt;master&gt;</w:t>
-      </w:r>
+        <w:t>&lt;</w:t>
+      </w:r>
+      <w:proofErr w:type="gramStart"/>
       <w:r>
         <w:rPr>
           <w:b/>
         </w:rPr>
+        <w:t>master</w:t>
+      </w:r>
+      <w:proofErr w:type="gramEnd"/>
+      <w:r>
+        <w:rPr>
+          <w:b/>
+        </w:rPr>
+        <w:t>&gt;</w:t>
+      </w:r>
+      <w:r>
+        <w:rPr>
+          <w:b/>
+        </w:rPr>
         <w:tab/>
       </w:r>
       <w:r>
-        <w:t>A boolean which is true if that node is the master node or the node that the application was initially run. Only required for the master node.</w:t>
+        <w:t xml:space="preserve">A </w:t>
+      </w:r>
+      <w:proofErr w:type="spellStart"/>
+      <w:r>
+        <w:t>boolean</w:t>
+      </w:r>
+      <w:proofErr w:type="spellEnd"/>
+      <w:r>
+        <w:t xml:space="preserve"> which is true if that node is the master node or the node that the application was initially run. Only required for the master node.</w:t>
       </w:r>
     </w:p>
     <w:p>
@@ -4258,7 +5606,21 @@
         <w:rPr>
           <w:b/>
         </w:rPr>
-        <w:t xml:space="preserve">&lt;hostname&gt; </w:t>
+        <w:t>&lt;</w:t>
+      </w:r>
+      <w:proofErr w:type="gramStart"/>
+      <w:r>
+        <w:rPr>
+          <w:b/>
+        </w:rPr>
+        <w:t>hostname</w:t>
+      </w:r>
+      <w:proofErr w:type="gramEnd"/>
+      <w:r>
+        <w:rPr>
+          <w:b/>
+        </w:rPr>
+        <w:t xml:space="preserve">&gt; </w:t>
       </w:r>
       <w:r>
         <w:rPr>
@@ -4282,12 +5644,28 @@
         <w:rPr>
           <w:b/>
         </w:rPr>
-        <w:t>&lt;javahome&gt;</w:t>
-      </w:r>
+        <w:t>&lt;</w:t>
+      </w:r>
+      <w:proofErr w:type="spellStart"/>
+      <w:proofErr w:type="gramStart"/>
       <w:r>
         <w:rPr>
           <w:b/>
         </w:rPr>
+        <w:t>javahome</w:t>
+      </w:r>
+      <w:proofErr w:type="spellEnd"/>
+      <w:proofErr w:type="gramEnd"/>
+      <w:r>
+        <w:rPr>
+          <w:b/>
+        </w:rPr>
+        <w:t>&gt;</w:t>
+      </w:r>
+      <w:r>
+        <w:rPr>
+          <w:b/>
+        </w:rPr>
         <w:tab/>
       </w:r>
       <w:r>
@@ -4324,7 +5702,13 @@
         <w:t xml:space="preserve">java </w:t>
       </w:r>
       <w:r>
-        <w:t>executable is part of the system path, this element can be left blank.</w:t>
+        <w:t xml:space="preserve">executable is part of the system path, this element can be </w:t>
+      </w:r>
+      <w:r>
+        <w:t>omitted</w:t>
+      </w:r>
+      <w:r>
+        <w:t>.</w:t>
       </w:r>
     </w:p>
     <w:p>
@@ -4339,7 +5723,23 @@
         <w:rPr>
           <w:b/>
         </w:rPr>
-        <w:t>&lt;masshome&gt;</w:t>
+        <w:t>&lt;</w:t>
+      </w:r>
+      <w:proofErr w:type="spellStart"/>
+      <w:proofErr w:type="gramStart"/>
+      <w:r>
+        <w:rPr>
+          <w:b/>
+        </w:rPr>
+        <w:t>masshome</w:t>
+      </w:r>
+      <w:proofErr w:type="spellEnd"/>
+      <w:proofErr w:type="gramEnd"/>
+      <w:r>
+        <w:rPr>
+          <w:b/>
+        </w:rPr>
+        <w:t>&gt;</w:t>
       </w:r>
       <w:r>
         <w:rPr>
@@ -4363,12 +5763,26 @@
         <w:rPr>
           <w:b/>
         </w:rPr>
-        <w:t>&lt;username&gt;</w:t>
-      </w:r>
+        <w:t>&lt;</w:t>
+      </w:r>
+      <w:proofErr w:type="gramStart"/>
       <w:r>
         <w:rPr>
           <w:b/>
         </w:rPr>
+        <w:t>username</w:t>
+      </w:r>
+      <w:proofErr w:type="gramEnd"/>
+      <w:r>
+        <w:rPr>
+          <w:b/>
+        </w:rPr>
+        <w:t>&gt;</w:t>
+      </w:r>
+      <w:r>
+        <w:rPr>
+          <w:b/>
+        </w:rPr>
         <w:tab/>
       </w:r>
       <w:r>
@@ -4383,12 +5797,28 @@
         <w:rPr>
           <w:b/>
         </w:rPr>
-        <w:t>&lt;privatekey&gt;</w:t>
-      </w:r>
+        <w:t>&lt;</w:t>
+      </w:r>
+      <w:proofErr w:type="spellStart"/>
+      <w:proofErr w:type="gramStart"/>
       <w:r>
         <w:rPr>
           <w:b/>
         </w:rPr>
+        <w:t>privatekey</w:t>
+      </w:r>
+      <w:proofErr w:type="spellEnd"/>
+      <w:proofErr w:type="gramEnd"/>
+      <w:r>
+        <w:rPr>
+          <w:b/>
+        </w:rPr>
+        <w:t>&gt;</w:t>
+      </w:r>
+      <w:r>
+        <w:rPr>
+          <w:b/>
+        </w:rPr>
         <w:tab/>
       </w:r>
       <w:r>
@@ -4398,8 +5828,30 @@
         <w:rPr>
           <w:i/>
         </w:rPr>
-        <w:t>~/.ssh/id_rsa</w:t>
-      </w:r>
+        <w:t>~/.</w:t>
+      </w:r>
+      <w:proofErr w:type="spellStart"/>
+      <w:r>
+        <w:rPr>
+          <w:i/>
+        </w:rPr>
+        <w:t>ssh</w:t>
+      </w:r>
+      <w:proofErr w:type="spellEnd"/>
+      <w:r>
+        <w:rPr>
+          <w:i/>
+        </w:rPr>
+        <w:t>/</w:t>
+      </w:r>
+      <w:proofErr w:type="spellStart"/>
+      <w:r>
+        <w:rPr>
+          <w:i/>
+        </w:rPr>
+        <w:t>id_rsa</w:t>
+      </w:r>
+      <w:proofErr w:type="spellEnd"/>
       <w:r>
         <w:t xml:space="preserve"> in this field.</w:t>
       </w:r>
@@ -4409,7 +5861,7 @@
         <w:t>To run the executable, type the followi</w:t>
       </w:r>
       <w:r>
-        <w:t>ng commands in the command line.</w:t>
+        <w:t>ng commands in the command line:</w:t>
       </w:r>
     </w:p>
     <w:p>
@@ -4457,15 +5909,25 @@
         <w:t xml:space="preserve">-X </w:t>
       </w:r>
       <w:r>
-        <w:t xml:space="preserve">flag when entering the SSH command. If you are using PuTTY, you will need to download and install </w:t>
+        <w:t xml:space="preserve">flag when entering the SSH command. If you are using </w:t>
+      </w:r>
+      <w:proofErr w:type="spellStart"/>
+      <w:r>
+        <w:t>PuTTY</w:t>
+      </w:r>
+      <w:proofErr w:type="spellEnd"/>
+      <w:r>
+        <w:t xml:space="preserve">, you will need to download and install </w:t>
       </w:r>
       <w:hyperlink r:id="rId14" w:history="1">
+        <w:proofErr w:type="spellStart"/>
         <w:r>
           <w:rPr>
             <w:rStyle w:val="Hyperlink"/>
           </w:rPr>
           <w:t>Xming</w:t>
         </w:r>
+        <w:proofErr w:type="spellEnd"/>
       </w:hyperlink>
       <w:r>
         <w:t xml:space="preserve">, and check the </w:t>
@@ -4493,7 +5955,7 @@
       <w:pPr>
         <w:pStyle w:val="Heading2"/>
       </w:pPr>
-      <w:bookmarkStart w:id="19" w:name="_Toc460327700"/>
+      <w:bookmarkStart w:id="19" w:name="_Toc465367257"/>
       <w:r>
         <w:t>Debugging Applications</w:t>
       </w:r>
@@ -4519,11 +5981,7 @@
         <w:t>Agents</w:t>
       </w:r>
       <w:r>
-        <w:t xml:space="preserve"> and pause the application at any </w:t>
-      </w:r>
-      <w:r>
-        <w:lastRenderedPageBreak/>
-        <w:t xml:space="preserve">time. The MASS application needs an extra two lines in the main to initialize the MASS end of the debugger as well as two extra functions added to both of the overridden </w:t>
+        <w:t xml:space="preserve"> and pause the application at any time. The MASS application needs an extra two lines in the main to initialize the MASS end of the debugger as well as two extra functions added to both of the overridden </w:t>
       </w:r>
       <w:r>
         <w:rPr>
@@ -4569,7 +6027,7 @@
 </file>
 
 <file path=word/endnotes.xml><?xml version="1.0" encoding="utf-8"?>
-<w:endnotes xmlns:wpc="http://schemas.microsoft.com/office/word/2010/wordprocessingCanvas" xmlns:cx="http://schemas.microsoft.com/office/drawing/2014/chartex" xmlns:cx1="http://schemas.microsoft.com/office/drawing/2015/9/8/chartex" xmlns:cx2="http://schemas.microsoft.com/office/drawing/2015/10/21/chartex" xmlns:mc="http://schemas.openxmlformats.org/markup-compatibility/2006" xmlns:o="urn:schemas-microsoft-com:office:office" xmlns:r="http://schemas.openxmlformats.org/officeDocument/2006/relationships" xmlns:m="http://schemas.openxmlformats.org/officeDocument/2006/math" xmlns:v="urn:schemas-microsoft-com:vml" xmlns:wp14="http://schemas.microsoft.com/office/word/2010/wordprocessingDrawing" xmlns:wp="http://schemas.openxmlformats.org/drawingml/2006/wordprocessingDrawing" xmlns:w10="urn:schemas-microsoft-com:office:word" xmlns:w="http://schemas.openxmlformats.org/wordprocessingml/2006/main" xmlns:w14="http://schemas.microsoft.com/office/word/2010/wordml" xmlns:w15="http://schemas.microsoft.com/office/word/2012/wordml" xmlns:w16se="http://schemas.microsoft.com/office/word/2015/wordml/symex" xmlns:wpg="http://schemas.microsoft.com/office/word/2010/wordprocessingGroup" xmlns:wpi="http://schemas.microsoft.com/office/word/2010/wordprocessingInk" xmlns:wne="http://schemas.microsoft.com/office/word/2006/wordml" xmlns:wps="http://schemas.microsoft.com/office/word/2010/wordprocessingShape" mc:Ignorable="w14 w15 w16se wp14">
+<w:endnotes xmlns:wpc="http://schemas.microsoft.com/office/word/2010/wordprocessingCanvas" xmlns:mc="http://schemas.openxmlformats.org/markup-compatibility/2006" xmlns:o="urn:schemas-microsoft-com:office:office" xmlns:r="http://schemas.openxmlformats.org/officeDocument/2006/relationships" xmlns:m="http://schemas.openxmlformats.org/officeDocument/2006/math" xmlns:v="urn:schemas-microsoft-com:vml" xmlns:wp14="http://schemas.microsoft.com/office/word/2010/wordprocessingDrawing" xmlns:wp="http://schemas.openxmlformats.org/drawingml/2006/wordprocessingDrawing" xmlns:w10="urn:schemas-microsoft-com:office:word" xmlns:w="http://schemas.openxmlformats.org/wordprocessingml/2006/main" xmlns:w14="http://schemas.microsoft.com/office/word/2010/wordml" xmlns:w15="http://schemas.microsoft.com/office/word/2012/wordml" xmlns:wpg="http://schemas.microsoft.com/office/word/2010/wordprocessingGroup" xmlns:wpi="http://schemas.microsoft.com/office/word/2010/wordprocessingInk" xmlns:wne="http://schemas.microsoft.com/office/word/2006/wordml" xmlns:wps="http://schemas.microsoft.com/office/word/2010/wordprocessingShape" mc:Ignorable="w14 w15 wp14">
   <w:endnote w:type="separator" w:id="-1">
     <w:p>
       <w:r>
@@ -4588,7 +6046,7 @@
 </file>
 
 <file path=word/footer1.xml><?xml version="1.0" encoding="utf-8"?>
-<w:ftr xmlns:wpc="http://schemas.microsoft.com/office/word/2010/wordprocessingCanvas" xmlns:cx="http://schemas.microsoft.com/office/drawing/2014/chartex" xmlns:cx1="http://schemas.microsoft.com/office/drawing/2015/9/8/chartex" xmlns:cx2="http://schemas.microsoft.com/office/drawing/2015/10/21/chartex" xmlns:mc="http://schemas.openxmlformats.org/markup-compatibility/2006" xmlns:o="urn:schemas-microsoft-com:office:office" xmlns:r="http://schemas.openxmlformats.org/officeDocument/2006/relationships" xmlns:m="http://schemas.openxmlformats.org/officeDocument/2006/math" xmlns:v="urn:schemas-microsoft-com:vml" xmlns:wp14="http://schemas.microsoft.com/office/word/2010/wordprocessingDrawing" xmlns:wp="http://schemas.openxmlformats.org/drawingml/2006/wordprocessingDrawing" xmlns:w10="urn:schemas-microsoft-com:office:word" xmlns:w="http://schemas.openxmlformats.org/wordprocessingml/2006/main" xmlns:w14="http://schemas.microsoft.com/office/word/2010/wordml" xmlns:w15="http://schemas.microsoft.com/office/word/2012/wordml" xmlns:w16se="http://schemas.microsoft.com/office/word/2015/wordml/symex" xmlns:wpg="http://schemas.microsoft.com/office/word/2010/wordprocessingGroup" xmlns:wpi="http://schemas.microsoft.com/office/word/2010/wordprocessingInk" xmlns:wne="http://schemas.microsoft.com/office/word/2006/wordml" xmlns:wps="http://schemas.microsoft.com/office/word/2010/wordprocessingShape" mc:Ignorable="w14 w15 w16se wp14">
+<w:ftr xmlns:wpc="http://schemas.microsoft.com/office/word/2010/wordprocessingCanvas" xmlns:mc="http://schemas.openxmlformats.org/markup-compatibility/2006" xmlns:o="urn:schemas-microsoft-com:office:office" xmlns:r="http://schemas.openxmlformats.org/officeDocument/2006/relationships" xmlns:m="http://schemas.openxmlformats.org/officeDocument/2006/math" xmlns:v="urn:schemas-microsoft-com:vml" xmlns:wp14="http://schemas.microsoft.com/office/word/2010/wordprocessingDrawing" xmlns:wp="http://schemas.openxmlformats.org/drawingml/2006/wordprocessingDrawing" xmlns:w10="urn:schemas-microsoft-com:office:word" xmlns:w="http://schemas.openxmlformats.org/wordprocessingml/2006/main" xmlns:w14="http://schemas.microsoft.com/office/word/2010/wordml" xmlns:w15="http://schemas.microsoft.com/office/word/2012/wordml" xmlns:wpg="http://schemas.microsoft.com/office/word/2010/wordprocessingGroup" xmlns:wpi="http://schemas.microsoft.com/office/word/2010/wordprocessingInk" xmlns:wne="http://schemas.microsoft.com/office/word/2006/wordml" xmlns:wps="http://schemas.microsoft.com/office/word/2010/wordprocessingShape" mc:Ignorable="w14 w15 wp14">
   <w:p>
     <w:pPr>
       <w:pStyle w:val="Footer"/>
@@ -4643,7 +6101,7 @@
         <w:b/>
         <w:noProof/>
       </w:rPr>
-      <w:t>2</w:t>
+      <w:t>1</w:t>
     </w:r>
     <w:r>
       <w:rPr>
@@ -4657,7 +6115,7 @@
 </file>
 
 <file path=word/footnotes.xml><?xml version="1.0" encoding="utf-8"?>
-<w:footnotes xmlns:wpc="http://schemas.microsoft.com/office/word/2010/wordprocessingCanvas" xmlns:cx="http://schemas.microsoft.com/office/drawing/2014/chartex" xmlns:cx1="http://schemas.microsoft.com/office/drawing/2015/9/8/chartex" xmlns:cx2="http://schemas.microsoft.com/office/drawing/2015/10/21/chartex" xmlns:mc="http://schemas.openxmlformats.org/markup-compatibility/2006" xmlns:o="urn:schemas-microsoft-com:office:office" xmlns:r="http://schemas.openxmlformats.org/officeDocument/2006/relationships" xmlns:m="http://schemas.openxmlformats.org/officeDocument/2006/math" xmlns:v="urn:schemas-microsoft-com:vml" xmlns:wp14="http://schemas.microsoft.com/office/word/2010/wordprocessingDrawing" xmlns:wp="http://schemas.openxmlformats.org/drawingml/2006/wordprocessingDrawing" xmlns:w10="urn:schemas-microsoft-com:office:word" xmlns:w="http://schemas.openxmlformats.org/wordprocessingml/2006/main" xmlns:w14="http://schemas.microsoft.com/office/word/2010/wordml" xmlns:w15="http://schemas.microsoft.com/office/word/2012/wordml" xmlns:w16se="http://schemas.microsoft.com/office/word/2015/wordml/symex" xmlns:wpg="http://schemas.microsoft.com/office/word/2010/wordprocessingGroup" xmlns:wpi="http://schemas.microsoft.com/office/word/2010/wordprocessingInk" xmlns:wne="http://schemas.microsoft.com/office/word/2006/wordml" xmlns:wps="http://schemas.microsoft.com/office/word/2010/wordprocessingShape" mc:Ignorable="w14 w15 w16se wp14">
+<w:footnotes xmlns:wpc="http://schemas.microsoft.com/office/word/2010/wordprocessingCanvas" xmlns:mc="http://schemas.openxmlformats.org/markup-compatibility/2006" xmlns:o="urn:schemas-microsoft-com:office:office" xmlns:r="http://schemas.openxmlformats.org/officeDocument/2006/relationships" xmlns:m="http://schemas.openxmlformats.org/officeDocument/2006/math" xmlns:v="urn:schemas-microsoft-com:vml" xmlns:wp14="http://schemas.microsoft.com/office/word/2010/wordprocessingDrawing" xmlns:wp="http://schemas.openxmlformats.org/drawingml/2006/wordprocessingDrawing" xmlns:w10="urn:schemas-microsoft-com:office:word" xmlns:w="http://schemas.openxmlformats.org/wordprocessingml/2006/main" xmlns:w14="http://schemas.microsoft.com/office/word/2010/wordml" xmlns:w15="http://schemas.microsoft.com/office/word/2012/wordml" xmlns:wpg="http://schemas.microsoft.com/office/word/2010/wordprocessingGroup" xmlns:wpi="http://schemas.microsoft.com/office/word/2010/wordprocessingInk" xmlns:wne="http://schemas.microsoft.com/office/word/2006/wordml" xmlns:wps="http://schemas.microsoft.com/office/word/2010/wordprocessingShape" mc:Ignorable="w14 w15 wp14">
   <w:footnote w:type="separator" w:id="-1">
     <w:p>
       <w:r>
@@ -4676,7 +6134,7 @@
 </file>
 
 <file path=word/header1.xml><?xml version="1.0" encoding="utf-8"?>
-<w:hdr xmlns:wpc="http://schemas.microsoft.com/office/word/2010/wordprocessingCanvas" xmlns:cx="http://schemas.microsoft.com/office/drawing/2014/chartex" xmlns:cx1="http://schemas.microsoft.com/office/drawing/2015/9/8/chartex" xmlns:cx2="http://schemas.microsoft.com/office/drawing/2015/10/21/chartex" xmlns:mc="http://schemas.openxmlformats.org/markup-compatibility/2006" xmlns:o="urn:schemas-microsoft-com:office:office" xmlns:r="http://schemas.openxmlformats.org/officeDocument/2006/relationships" xmlns:m="http://schemas.openxmlformats.org/officeDocument/2006/math" xmlns:v="urn:schemas-microsoft-com:vml" xmlns:wp14="http://schemas.microsoft.com/office/word/2010/wordprocessingDrawing" xmlns:wp="http://schemas.openxmlformats.org/drawingml/2006/wordprocessingDrawing" xmlns:w10="urn:schemas-microsoft-com:office:word" xmlns:w="http://schemas.openxmlformats.org/wordprocessingml/2006/main" xmlns:w14="http://schemas.microsoft.com/office/word/2010/wordml" xmlns:w15="http://schemas.microsoft.com/office/word/2012/wordml" xmlns:w16se="http://schemas.microsoft.com/office/word/2015/wordml/symex" xmlns:wpg="http://schemas.microsoft.com/office/word/2010/wordprocessingGroup" xmlns:wpi="http://schemas.microsoft.com/office/word/2010/wordprocessingInk" xmlns:wne="http://schemas.microsoft.com/office/word/2006/wordml" xmlns:wps="http://schemas.microsoft.com/office/word/2010/wordprocessingShape" mc:Ignorable="w14 w15 w16se wp14">
+<w:hdr xmlns:wpc="http://schemas.microsoft.com/office/word/2010/wordprocessingCanvas" xmlns:mc="http://schemas.openxmlformats.org/markup-compatibility/2006" xmlns:o="urn:schemas-microsoft-com:office:office" xmlns:r="http://schemas.openxmlformats.org/officeDocument/2006/relationships" xmlns:m="http://schemas.openxmlformats.org/officeDocument/2006/math" xmlns:v="urn:schemas-microsoft-com:vml" xmlns:wp14="http://schemas.microsoft.com/office/word/2010/wordprocessingDrawing" xmlns:wp="http://schemas.openxmlformats.org/drawingml/2006/wordprocessingDrawing" xmlns:w10="urn:schemas-microsoft-com:office:word" xmlns:w="http://schemas.openxmlformats.org/wordprocessingml/2006/main" xmlns:w14="http://schemas.microsoft.com/office/word/2010/wordml" xmlns:w15="http://schemas.microsoft.com/office/word/2012/wordml" xmlns:wpg="http://schemas.microsoft.com/office/word/2010/wordprocessingGroup" xmlns:wpi="http://schemas.microsoft.com/office/word/2010/wordprocessingInk" xmlns:wne="http://schemas.microsoft.com/office/word/2006/wordml" xmlns:wps="http://schemas.microsoft.com/office/word/2010/wordprocessingShape" mc:Ignorable="w14 w15 wp14">
   <w:p>
     <w:pPr>
       <w:pStyle w:val="Foot"/>
@@ -4706,8 +6164,121 @@
 </file>
 
 <file path=word/numbering.xml><?xml version="1.0" encoding="utf-8"?>
-<w:numbering xmlns:wpc="http://schemas.microsoft.com/office/word/2010/wordprocessingCanvas" xmlns:cx="http://schemas.microsoft.com/office/drawing/2014/chartex" xmlns:cx1="http://schemas.microsoft.com/office/drawing/2015/9/8/chartex" xmlns:cx2="http://schemas.microsoft.com/office/drawing/2015/10/21/chartex" xmlns:mc="http://schemas.openxmlformats.org/markup-compatibility/2006" xmlns:o="urn:schemas-microsoft-com:office:office" xmlns:r="http://schemas.openxmlformats.org/officeDocument/2006/relationships" xmlns:m="http://schemas.openxmlformats.org/officeDocument/2006/math" xmlns:v="urn:schemas-microsoft-com:vml" xmlns:wp14="http://schemas.microsoft.com/office/word/2010/wordprocessingDrawing" xmlns:wp="http://schemas.openxmlformats.org/drawingml/2006/wordprocessingDrawing" xmlns:w10="urn:schemas-microsoft-com:office:word" xmlns:w="http://schemas.openxmlformats.org/wordprocessingml/2006/main" xmlns:w14="http://schemas.microsoft.com/office/word/2010/wordml" xmlns:w15="http://schemas.microsoft.com/office/word/2012/wordml" xmlns:w16se="http://schemas.microsoft.com/office/word/2015/wordml/symex" xmlns:wpg="http://schemas.microsoft.com/office/word/2010/wordprocessingGroup" xmlns:wpi="http://schemas.microsoft.com/office/word/2010/wordprocessingInk" xmlns:wne="http://schemas.microsoft.com/office/word/2006/wordml" xmlns:wps="http://schemas.microsoft.com/office/word/2010/wordprocessingShape" mc:Ignorable="w14 w15 w16se wp14">
+<w:numbering xmlns:wpc="http://schemas.microsoft.com/office/word/2010/wordprocessingCanvas" xmlns:mc="http://schemas.openxmlformats.org/markup-compatibility/2006" xmlns:o="urn:schemas-microsoft-com:office:office" xmlns:r="http://schemas.openxmlformats.org/officeDocument/2006/relationships" xmlns:m="http://schemas.openxmlformats.org/officeDocument/2006/math" xmlns:v="urn:schemas-microsoft-com:vml" xmlns:wp14="http://schemas.microsoft.com/office/word/2010/wordprocessingDrawing" xmlns:wp="http://schemas.openxmlformats.org/drawingml/2006/wordprocessingDrawing" xmlns:w10="urn:schemas-microsoft-com:office:word" xmlns:w="http://schemas.openxmlformats.org/wordprocessingml/2006/main" xmlns:w14="http://schemas.microsoft.com/office/word/2010/wordml" xmlns:w15="http://schemas.microsoft.com/office/word/2012/wordml" xmlns:wpg="http://schemas.microsoft.com/office/word/2010/wordprocessingGroup" xmlns:wpi="http://schemas.microsoft.com/office/word/2010/wordprocessingInk" xmlns:wne="http://schemas.microsoft.com/office/word/2006/wordml" xmlns:wps="http://schemas.microsoft.com/office/word/2010/wordprocessingShape" mc:Ignorable="w14 w15 wp14">
   <w:abstractNum w:abstractNumId="0" w15:restartNumberingAfterBreak="0">
+    <w:nsid w:val="10A41A4D"/>
+    <w:multiLevelType w:val="hybridMultilevel"/>
+    <w:tmpl w:val="5C30F9D2"/>
+    <w:lvl w:ilvl="0" w:tplc="04090001">
+      <w:start w:val="1"/>
+      <w:numFmt w:val="bullet"/>
+      <w:lvlText w:val=""/>
+      <w:lvlJc w:val="left"/>
+      <w:pPr>
+        <w:ind w:left="720" w:hanging="360"/>
+      </w:pPr>
+      <w:rPr>
+        <w:rFonts w:ascii="Symbol" w:hAnsi="Symbol" w:hint="default"/>
+      </w:rPr>
+    </w:lvl>
+    <w:lvl w:ilvl="1" w:tplc="04090003" w:tentative="1">
+      <w:start w:val="1"/>
+      <w:numFmt w:val="bullet"/>
+      <w:lvlText w:val="o"/>
+      <w:lvlJc w:val="left"/>
+      <w:pPr>
+        <w:ind w:left="1440" w:hanging="360"/>
+      </w:pPr>
+      <w:rPr>
+        <w:rFonts w:ascii="Courier New" w:hAnsi="Courier New" w:cs="Courier New" w:hint="default"/>
+      </w:rPr>
+    </w:lvl>
+    <w:lvl w:ilvl="2" w:tplc="04090005" w:tentative="1">
+      <w:start w:val="1"/>
+      <w:numFmt w:val="bullet"/>
+      <w:lvlText w:val=""/>
+      <w:lvlJc w:val="left"/>
+      <w:pPr>
+        <w:ind w:left="2160" w:hanging="360"/>
+      </w:pPr>
+      <w:rPr>
+        <w:rFonts w:ascii="Wingdings" w:hAnsi="Wingdings" w:hint="default"/>
+      </w:rPr>
+    </w:lvl>
+    <w:lvl w:ilvl="3" w:tplc="04090001" w:tentative="1">
+      <w:start w:val="1"/>
+      <w:numFmt w:val="bullet"/>
+      <w:lvlText w:val=""/>
+      <w:lvlJc w:val="left"/>
+      <w:pPr>
+        <w:ind w:left="2880" w:hanging="360"/>
+      </w:pPr>
+      <w:rPr>
+        <w:rFonts w:ascii="Symbol" w:hAnsi="Symbol" w:hint="default"/>
+      </w:rPr>
+    </w:lvl>
+    <w:lvl w:ilvl="4" w:tplc="04090003" w:tentative="1">
+      <w:start w:val="1"/>
+      <w:numFmt w:val="bullet"/>
+      <w:lvlText w:val="o"/>
+      <w:lvlJc w:val="left"/>
+      <w:pPr>
+        <w:ind w:left="3600" w:hanging="360"/>
+      </w:pPr>
+      <w:rPr>
+        <w:rFonts w:ascii="Courier New" w:hAnsi="Courier New" w:cs="Courier New" w:hint="default"/>
+      </w:rPr>
+    </w:lvl>
+    <w:lvl w:ilvl="5" w:tplc="04090005" w:tentative="1">
+      <w:start w:val="1"/>
+      <w:numFmt w:val="bullet"/>
+      <w:lvlText w:val=""/>
+      <w:lvlJc w:val="left"/>
+      <w:pPr>
+        <w:ind w:left="4320" w:hanging="360"/>
+      </w:pPr>
+      <w:rPr>
+        <w:rFonts w:ascii="Wingdings" w:hAnsi="Wingdings" w:hint="default"/>
+      </w:rPr>
+    </w:lvl>
+    <w:lvl w:ilvl="6" w:tplc="04090001" w:tentative="1">
+      <w:start w:val="1"/>
+      <w:numFmt w:val="bullet"/>
+      <w:lvlText w:val=""/>
+      <w:lvlJc w:val="left"/>
+      <w:pPr>
+        <w:ind w:left="5040" w:hanging="360"/>
+      </w:pPr>
+      <w:rPr>
+        <w:rFonts w:ascii="Symbol" w:hAnsi="Symbol" w:hint="default"/>
+      </w:rPr>
+    </w:lvl>
+    <w:lvl w:ilvl="7" w:tplc="04090003" w:tentative="1">
+      <w:start w:val="1"/>
+      <w:numFmt w:val="bullet"/>
+      <w:lvlText w:val="o"/>
+      <w:lvlJc w:val="left"/>
+      <w:pPr>
+        <w:ind w:left="5760" w:hanging="360"/>
+      </w:pPr>
+      <w:rPr>
+        <w:rFonts w:ascii="Courier New" w:hAnsi="Courier New" w:cs="Courier New" w:hint="default"/>
+      </w:rPr>
+    </w:lvl>
+    <w:lvl w:ilvl="8" w:tplc="04090005" w:tentative="1">
+      <w:start w:val="1"/>
+      <w:numFmt w:val="bullet"/>
+      <w:lvlText w:val=""/>
+      <w:lvlJc w:val="left"/>
+      <w:pPr>
+        <w:ind w:left="6480" w:hanging="360"/>
+      </w:pPr>
+      <w:rPr>
+        <w:rFonts w:ascii="Wingdings" w:hAnsi="Wingdings" w:hint="default"/>
+      </w:rPr>
+    </w:lvl>
+  </w:abstractNum>
+  <w:abstractNum w:abstractNumId="1" w15:restartNumberingAfterBreak="0">
     <w:nsid w:val="2020255C"/>
     <w:multiLevelType w:val="multilevel"/>
     <w:tmpl w:val="4B045178"/>
@@ -4795,14 +6366,13 @@
       </w:pPr>
     </w:lvl>
   </w:abstractNum>
-  <w:abstractNum w:abstractNumId="1" w15:restartNumberingAfterBreak="0">
+  <w:abstractNum w:abstractNumId="2" w15:restartNumberingAfterBreak="0">
     <w:nsid w:val="22CC1D2F"/>
     <w:multiLevelType w:val="hybridMultilevel"/>
     <w:tmpl w:val="7FE277BA"/>
     <w:lvl w:ilvl="0" w:tplc="B6F0C37E">
       <w:start w:val="1"/>
       <w:numFmt w:val="decimal"/>
-      <w:pStyle w:val="ListParagraph"/>
       <w:lvlText w:val="%1:"/>
       <w:lvlJc w:val="left"/>
       <w:pPr>
@@ -4885,7 +6455,7 @@
       </w:pPr>
     </w:lvl>
   </w:abstractNum>
-  <w:abstractNum w:abstractNumId="2" w15:restartNumberingAfterBreak="0">
+  <w:abstractNum w:abstractNumId="3" w15:restartNumberingAfterBreak="0">
     <w:nsid w:val="38862E70"/>
     <w:multiLevelType w:val="hybridMultilevel"/>
     <w:tmpl w:val="8B408F88"/>
@@ -4974,7 +6544,7 @@
       </w:pPr>
     </w:lvl>
   </w:abstractNum>
-  <w:abstractNum w:abstractNumId="3" w15:restartNumberingAfterBreak="0">
+  <w:abstractNum w:abstractNumId="4" w15:restartNumberingAfterBreak="0">
     <w:nsid w:val="415F17F6"/>
     <w:multiLevelType w:val="hybridMultilevel"/>
     <w:tmpl w:val="C7E40420"/>
@@ -5060,7 +6630,7 @@
       </w:pPr>
     </w:lvl>
   </w:abstractNum>
-  <w:abstractNum w:abstractNumId="4" w15:restartNumberingAfterBreak="0">
+  <w:abstractNum w:abstractNumId="5" w15:restartNumberingAfterBreak="0">
     <w:nsid w:val="54EC3199"/>
     <w:multiLevelType w:val="hybridMultilevel"/>
     <w:tmpl w:val="F962BC6C"/>
@@ -5149,7 +6719,7 @@
       </w:pPr>
     </w:lvl>
   </w:abstractNum>
-  <w:abstractNum w:abstractNumId="5" w15:restartNumberingAfterBreak="0">
+  <w:abstractNum w:abstractNumId="6" w15:restartNumberingAfterBreak="0">
     <w:nsid w:val="585322FA"/>
     <w:multiLevelType w:val="multilevel"/>
     <w:tmpl w:val="0409001F"/>
@@ -5235,7 +6805,7 @@
       </w:pPr>
     </w:lvl>
   </w:abstractNum>
-  <w:abstractNum w:abstractNumId="6" w15:restartNumberingAfterBreak="0">
+  <w:abstractNum w:abstractNumId="7" w15:restartNumberingAfterBreak="0">
     <w:nsid w:val="5B4B0CCE"/>
     <w:multiLevelType w:val="multilevel"/>
     <w:tmpl w:val="0409001F"/>
@@ -5322,31 +6892,34 @@
     </w:lvl>
   </w:abstractNum>
   <w:num w:numId="1">
+    <w:abstractNumId w:val="6"/>
+  </w:num>
+  <w:num w:numId="2">
+    <w:abstractNumId w:val="7"/>
+  </w:num>
+  <w:num w:numId="3">
+    <w:abstractNumId w:val="1"/>
+  </w:num>
+  <w:num w:numId="4">
+    <w:abstractNumId w:val="4"/>
+  </w:num>
+  <w:num w:numId="5">
     <w:abstractNumId w:val="5"/>
   </w:num>
-  <w:num w:numId="2">
-    <w:abstractNumId w:val="6"/>
-  </w:num>
-  <w:num w:numId="3">
-    <w:abstractNumId w:val="0"/>
-  </w:num>
-  <w:num w:numId="4">
+  <w:num w:numId="6">
     <w:abstractNumId w:val="3"/>
   </w:num>
-  <w:num w:numId="5">
-    <w:abstractNumId w:val="4"/>
-  </w:num>
-  <w:num w:numId="6">
+  <w:num w:numId="7">
     <w:abstractNumId w:val="2"/>
   </w:num>
-  <w:num w:numId="7">
-    <w:abstractNumId w:val="1"/>
+  <w:num w:numId="8">
+    <w:abstractNumId w:val="0"/>
   </w:num>
 </w:numbering>
 </file>
 
 <file path=word/styles.xml><?xml version="1.0" encoding="utf-8"?>
-<w:styles xmlns:mc="http://schemas.openxmlformats.org/markup-compatibility/2006" xmlns:r="http://schemas.openxmlformats.org/officeDocument/2006/relationships" xmlns:w="http://schemas.openxmlformats.org/wordprocessingml/2006/main" xmlns:w14="http://schemas.microsoft.com/office/word/2010/wordml" xmlns:w15="http://schemas.microsoft.com/office/word/2012/wordml" xmlns:w16se="http://schemas.microsoft.com/office/word/2015/wordml/symex" mc:Ignorable="w14 w15 w16se">
+<w:styles xmlns:mc="http://schemas.openxmlformats.org/markup-compatibility/2006" xmlns:r="http://schemas.openxmlformats.org/officeDocument/2006/relationships" xmlns:w="http://schemas.openxmlformats.org/wordprocessingml/2006/main" xmlns:w14="http://schemas.microsoft.com/office/word/2010/wordml" xmlns:w15="http://schemas.microsoft.com/office/word/2012/wordml" mc:Ignorable="w14 w15">
   <w:docDefaults>
     <w:rPrDefault>
       <w:rPr>
@@ -5362,7 +6935,7 @@
       </w:pPr>
     </w:pPrDefault>
   </w:docDefaults>
-  <w:latentStyles w:defLockedState="0" w:defUIPriority="99" w:defSemiHidden="0" w:defUnhideWhenUsed="0" w:defQFormat="0" w:count="373">
+  <w:latentStyles w:defLockedState="0" w:defUIPriority="99" w:defSemiHidden="0" w:defUnhideWhenUsed="0" w:defQFormat="0" w:count="371">
     <w:lsdException w:name="Normal" w:uiPriority="0" w:qFormat="1"/>
     <w:lsdException w:name="heading 1" w:uiPriority="9" w:qFormat="1"/>
     <w:lsdException w:name="heading 2" w:semiHidden="1" w:uiPriority="9" w:unhideWhenUsed="1" w:qFormat="1"/>
@@ -5734,8 +7307,6 @@
     <w:lsdException w:name="List Table 5 Dark Accent 6" w:uiPriority="50"/>
     <w:lsdException w:name="List Table 6 Colorful Accent 6" w:uiPriority="51"/>
     <w:lsdException w:name="List Table 7 Colorful Accent 6" w:uiPriority="52"/>
-    <w:lsdException w:name="Mention" w:semiHidden="1" w:unhideWhenUsed="1"/>
-    <w:lsdException w:name="Smart Hyperlink" w:semiHidden="1" w:unhideWhenUsed="1"/>
   </w:latentStyles>
   <w:style w:type="paragraph" w:default="1" w:styleId="Normal">
     <w:name w:val="Normal"/>
@@ -6476,7 +8047,7 @@
 </file>
 
 <file path=customXml/itemProps1.xml><?xml version="1.0" encoding="utf-8"?>
-<ds:datastoreItem xmlns:ds="http://schemas.openxmlformats.org/officeDocument/2006/customXml" ds:itemID="{76FC07B9-7B3C-490E-8AB4-270AACC33F2D}">
+<ds:datastoreItem xmlns:ds="http://schemas.openxmlformats.org/officeDocument/2006/customXml" ds:itemID="{8F4E4627-5B94-4847-BB0A-DA034E682DE5}">
   <ds:schemaRefs>
     <ds:schemaRef ds:uri="http://schemas.openxmlformats.org/officeDocument/2006/bibliography"/>
   </ds:schemaRefs>

</xml_diff>

<commit_message>
Slight wordsmithing on creating SSH keys
</commit_message>
<xml_diff>
--- a/docs/MASS Java Developer Guide.docx
+++ b/docs/MASS Java Developer Guide.docx
@@ -79,8 +79,6 @@
       </w:r>
       <w:bookmarkEnd w:id="1"/>
     </w:p>
-    <w:bookmarkStart w:id="2" w:name="_GoBack"/>
-    <w:bookmarkEnd w:id="2"/>
     <w:p>
       <w:pPr>
         <w:pStyle w:val="TOC1"/>
@@ -1769,24 +1767,24 @@
       <w:r>
         <w:fldChar w:fldCharType="end"/>
       </w:r>
-      <w:bookmarkStart w:id="3" w:name="_Toc465367241"/>
+      <w:bookmarkStart w:id="2" w:name="_Toc465367241"/>
       <w:r>
         <w:t>Development Environment</w:t>
       </w:r>
+      <w:bookmarkEnd w:id="2"/>
+    </w:p>
+    <w:p>
+      <w:pPr>
+        <w:pStyle w:val="Heading2"/>
+      </w:pPr>
+      <w:bookmarkStart w:id="3" w:name="_Toc465367242"/>
+      <w:r>
+        <w:t>Location of MASS Java and Applications</w:t>
+      </w:r>
+      <w:r>
+        <w:t xml:space="preserve"> Source Code</w:t>
+      </w:r>
       <w:bookmarkEnd w:id="3"/>
-    </w:p>
-    <w:p>
-      <w:pPr>
-        <w:pStyle w:val="Heading2"/>
-      </w:pPr>
-      <w:bookmarkStart w:id="4" w:name="_Toc465367242"/>
-      <w:r>
-        <w:t>Location of MASS Java and Applications</w:t>
-      </w:r>
-      <w:r>
-        <w:t xml:space="preserve"> Source Code</w:t>
-      </w:r>
-      <w:bookmarkEnd w:id="4"/>
     </w:p>
     <w:p>
       <w:r>
@@ -1910,11 +1908,11 @@
       <w:pPr>
         <w:pStyle w:val="Heading2"/>
       </w:pPr>
-      <w:bookmarkStart w:id="5" w:name="_Toc465367243"/>
+      <w:bookmarkStart w:id="4" w:name="_Toc465367243"/>
       <w:r>
         <w:t>Getting a Copy of the Code for Development</w:t>
       </w:r>
-      <w:bookmarkEnd w:id="5"/>
+      <w:bookmarkEnd w:id="4"/>
     </w:p>
     <w:p>
       <w:r>
@@ -2013,14 +2011,14 @@
       <w:pPr>
         <w:pStyle w:val="Heading2"/>
       </w:pPr>
-      <w:bookmarkStart w:id="6" w:name="_Toc465367244"/>
+      <w:bookmarkStart w:id="5" w:name="_Toc465367244"/>
       <w:r>
         <w:t xml:space="preserve">Execution </w:t>
       </w:r>
       <w:r>
         <w:t>Environment</w:t>
       </w:r>
-      <w:bookmarkEnd w:id="6"/>
+      <w:bookmarkEnd w:id="5"/>
     </w:p>
     <w:p>
       <w:r>
@@ -2196,7 +2194,19 @@
         </w:numPr>
       </w:pPr>
       <w:r>
-        <w:t>Make sure not to include a passphrase</w:t>
+        <w:t xml:space="preserve">Make sure </w:t>
+      </w:r>
+      <w:r>
+        <w:t xml:space="preserve">to </w:t>
+      </w:r>
+      <w:r>
+        <w:rPr>
+          <w:b/>
+        </w:rPr>
+        <w:t>not</w:t>
+      </w:r>
+      <w:r>
+        <w:t xml:space="preserve"> include a passphrase</w:t>
       </w:r>
       <w:r>
         <w:t>;</w:t>
@@ -2372,21 +2382,21 @@
       <w:pPr>
         <w:pStyle w:val="Heading1"/>
       </w:pPr>
-      <w:bookmarkStart w:id="7" w:name="_Toc465367245"/>
+      <w:bookmarkStart w:id="6" w:name="_Toc465367245"/>
       <w:r>
         <w:t>Making Changes to MASS</w:t>
       </w:r>
+      <w:bookmarkEnd w:id="6"/>
+    </w:p>
+    <w:p>
+      <w:pPr>
+        <w:pStyle w:val="Heading2"/>
+      </w:pPr>
+      <w:bookmarkStart w:id="7" w:name="_Toc465367246"/>
+      <w:r>
+        <w:t>Pushing Changes</w:t>
+      </w:r>
       <w:bookmarkEnd w:id="7"/>
-    </w:p>
-    <w:p>
-      <w:pPr>
-        <w:pStyle w:val="Heading2"/>
-      </w:pPr>
-      <w:bookmarkStart w:id="8" w:name="_Toc465367246"/>
-      <w:r>
-        <w:t>Pushing Changes</w:t>
-      </w:r>
-      <w:bookmarkEnd w:id="8"/>
     </w:p>
     <w:p>
       <w:r>
@@ -2438,10 +2448,12 @@
       <w:pPr>
         <w:pStyle w:val="Heading2"/>
       </w:pPr>
-      <w:bookmarkStart w:id="9" w:name="_Toc465367247"/>
+      <w:bookmarkStart w:id="8" w:name="_Toc465367247"/>
       <w:r>
         <w:t>Building MASS</w:t>
       </w:r>
+      <w:bookmarkStart w:id="9" w:name="_GoBack"/>
+      <w:bookmarkEnd w:id="8"/>
       <w:bookmarkEnd w:id="9"/>
     </w:p>
     <w:p>
@@ -6101,7 +6113,7 @@
         <w:b/>
         <w:noProof/>
       </w:rPr>
-      <w:t>1</w:t>
+      <w:t>6</w:t>
     </w:r>
     <w:r>
       <w:rPr>
@@ -8047,7 +8059,7 @@
 </file>
 
 <file path=customXml/itemProps1.xml><?xml version="1.0" encoding="utf-8"?>
-<ds:datastoreItem xmlns:ds="http://schemas.openxmlformats.org/officeDocument/2006/customXml" ds:itemID="{8F4E4627-5B94-4847-BB0A-DA034E682DE5}">
+<ds:datastoreItem xmlns:ds="http://schemas.openxmlformats.org/officeDocument/2006/customXml" ds:itemID="{E4EF24C4-C96E-41A4-B419-9BAAAE29E19A}">
   <ds:schemaRefs>
     <ds:schemaRef ds:uri="http://schemas.openxmlformats.org/officeDocument/2006/bibliography"/>
   </ds:schemaRefs>

</xml_diff>

<commit_message>
Minor revision to SSH key generation instructions to not reference UWB Linux Lab (community users won't have access to UWB resources)
</commit_message>
<xml_diff>
--- a/docs/MASS Java Developer Guide.docx
+++ b/docs/MASS Java Developer Guide.docx
@@ -1,6 +1,6 @@
 
 <file path=word/document.xml><?xml version="1.0" encoding="utf-8"?>
-<w:document xmlns:wpc="http://schemas.microsoft.com/office/word/2010/wordprocessingCanvas" xmlns:mc="http://schemas.openxmlformats.org/markup-compatibility/2006" xmlns:o="urn:schemas-microsoft-com:office:office" xmlns:r="http://schemas.openxmlformats.org/officeDocument/2006/relationships" xmlns:m="http://schemas.openxmlformats.org/officeDocument/2006/math" xmlns:v="urn:schemas-microsoft-com:vml" xmlns:wp14="http://schemas.microsoft.com/office/word/2010/wordprocessingDrawing" xmlns:wp="http://schemas.openxmlformats.org/drawingml/2006/wordprocessingDrawing" xmlns:w10="urn:schemas-microsoft-com:office:word" xmlns:w="http://schemas.openxmlformats.org/wordprocessingml/2006/main" xmlns:w14="http://schemas.microsoft.com/office/word/2010/wordml" xmlns:w15="http://schemas.microsoft.com/office/word/2012/wordml" xmlns:wpg="http://schemas.microsoft.com/office/word/2010/wordprocessingGroup" xmlns:wpi="http://schemas.microsoft.com/office/word/2010/wordprocessingInk" xmlns:wne="http://schemas.microsoft.com/office/word/2006/wordml" xmlns:wps="http://schemas.microsoft.com/office/word/2010/wordprocessingShape" mc:Ignorable="w14 w15 wp14">
+<w:document xmlns:wpc="http://schemas.microsoft.com/office/word/2010/wordprocessingCanvas" xmlns:cx="http://schemas.microsoft.com/office/drawing/2014/chartex" xmlns:cx1="http://schemas.microsoft.com/office/drawing/2015/9/8/chartex" xmlns:mc="http://schemas.openxmlformats.org/markup-compatibility/2006" xmlns:o="urn:schemas-microsoft-com:office:office" xmlns:r="http://schemas.openxmlformats.org/officeDocument/2006/relationships" xmlns:m="http://schemas.openxmlformats.org/officeDocument/2006/math" xmlns:v="urn:schemas-microsoft-com:vml" xmlns:wp14="http://schemas.microsoft.com/office/word/2010/wordprocessingDrawing" xmlns:wp="http://schemas.openxmlformats.org/drawingml/2006/wordprocessingDrawing" xmlns:w10="urn:schemas-microsoft-com:office:word" xmlns:w="http://schemas.openxmlformats.org/wordprocessingml/2006/main" xmlns:w14="http://schemas.microsoft.com/office/word/2010/wordml" xmlns:w15="http://schemas.microsoft.com/office/word/2012/wordml" xmlns:w16se="http://schemas.microsoft.com/office/word/2015/wordml/symex" xmlns:wpg="http://schemas.microsoft.com/office/word/2010/wordprocessingGroup" xmlns:wpi="http://schemas.microsoft.com/office/word/2010/wordprocessingInk" xmlns:wne="http://schemas.microsoft.com/office/word/2006/wordml" xmlns:wps="http://schemas.microsoft.com/office/word/2010/wordprocessingShape" mc:Ignorable="w14 w15 w16se wp14">
   <w:body>
     <w:p>
       <w:pPr>
@@ -2027,22 +2027,38 @@
     </w:p>
     <w:p>
       <w:r>
+        <w:t>Please note that the following instructions assume that all nodes are sharing the home directory of the user that will be running MASS applications.</w:t>
+      </w:r>
+    </w:p>
+    <w:p>
+      <w:r>
         <w:t xml:space="preserve">To </w:t>
       </w:r>
       <w:r>
         <w:t>generate these keys</w:t>
       </w:r>
       <w:r>
-        <w:t xml:space="preserve">, </w:t>
-      </w:r>
-      <w:r>
-        <w:t xml:space="preserve">log in to a Linux lab computer and </w:t>
-      </w:r>
-      <w:r>
-        <w:t>type the follo</w:t>
-      </w:r>
-      <w:r>
-        <w:t>wing commands into the terminal:</w:t>
+        <w:t xml:space="preserve"> using a Linux </w:t>
+      </w:r>
+      <w:r>
+        <w:t>computer</w:t>
+      </w:r>
+      <w:r>
+        <w:t xml:space="preserve"> use</w:t>
+      </w:r>
+      <w:r>
+        <w:t xml:space="preserve"> </w:t>
+      </w:r>
+      <w:bookmarkStart w:id="6" w:name="_GoBack"/>
+      <w:bookmarkEnd w:id="6"/>
+      <w:r>
+        <w:t xml:space="preserve">the </w:t>
+      </w:r>
+      <w:r>
+        <w:t>follo</w:t>
+      </w:r>
+      <w:r>
+        <w:t>wing commands:</w:t>
       </w:r>
     </w:p>
     <w:p>
@@ -2382,21 +2398,22 @@
       <w:pPr>
         <w:pStyle w:val="Heading1"/>
       </w:pPr>
-      <w:bookmarkStart w:id="6" w:name="_Toc465367245"/>
-      <w:r>
+      <w:bookmarkStart w:id="7" w:name="_Toc465367245"/>
+      <w:r>
+        <w:lastRenderedPageBreak/>
         <w:t>Making Changes to MASS</w:t>
       </w:r>
-      <w:bookmarkEnd w:id="6"/>
+      <w:bookmarkEnd w:id="7"/>
     </w:p>
     <w:p>
       <w:pPr>
         <w:pStyle w:val="Heading2"/>
       </w:pPr>
-      <w:bookmarkStart w:id="7" w:name="_Toc465367246"/>
+      <w:bookmarkStart w:id="8" w:name="_Toc465367246"/>
       <w:r>
         <w:t>Pushing Changes</w:t>
       </w:r>
-      <w:bookmarkEnd w:id="7"/>
+      <w:bookmarkEnd w:id="8"/>
     </w:p>
     <w:p>
       <w:r>
@@ -2440,7 +2457,6 @@
     </w:p>
     <w:p>
       <w:r>
-        <w:lastRenderedPageBreak/>
         <w:t>If you want to add a feature, branch off of the develop branch and commit changes to that branch. When you are finished with your feature, and it is tested, merge your branch to the develop branch and fix any merge conflicts if they show up.</w:t>
       </w:r>
     </w:p>
@@ -2448,12 +2464,10 @@
       <w:pPr>
         <w:pStyle w:val="Heading2"/>
       </w:pPr>
-      <w:bookmarkStart w:id="8" w:name="_Toc465367247"/>
+      <w:bookmarkStart w:id="9" w:name="_Toc465367247"/>
       <w:r>
         <w:t>Building MASS</w:t>
       </w:r>
-      <w:bookmarkStart w:id="9" w:name="_GoBack"/>
-      <w:bookmarkEnd w:id="8"/>
       <w:bookmarkEnd w:id="9"/>
     </w:p>
     <w:p>
@@ -2672,7 +2686,11 @@
         <w:t>number</w:t>
       </w:r>
       <w:r>
-        <w:t xml:space="preserve"> of Places and Agents. Also, if the MASS application is being run somewhere with limited disk space, it is recommended to delete the log files or to move them somewhere else, otherwise Java will crash.</w:t>
+        <w:t xml:space="preserve"> of </w:t>
+      </w:r>
+      <w:r>
+        <w:lastRenderedPageBreak/>
+        <w:t>Places and Agents. Also, if the MASS application is being run somewhere with limited disk space, it is recommended to delete the log files or to move them somewhere else, otherwise Java will crash.</w:t>
       </w:r>
     </w:p>
     <w:p>
@@ -2697,7 +2715,6 @@
       </w:pPr>
       <w:bookmarkStart w:id="12" w:name="_Toc465367250"/>
       <w:r>
-        <w:lastRenderedPageBreak/>
         <w:t>MASS Components</w:t>
       </w:r>
       <w:bookmarkEnd w:id="12"/>
@@ -3101,6 +3118,7 @@
       </w:pPr>
       <w:bookmarkStart w:id="15" w:name="_Toc465367253"/>
       <w:r>
+        <w:lastRenderedPageBreak/>
         <w:t>Creating Applications for MASS</w:t>
       </w:r>
       <w:bookmarkEnd w:id="15"/>
@@ -3236,7 +3254,6 @@
         </w:numPr>
       </w:pPr>
       <w:r>
-        <w:lastRenderedPageBreak/>
         <w:t xml:space="preserve">When prompted to enter </w:t>
       </w:r>
       <w:proofErr w:type="spellStart"/>
@@ -4170,6 +4187,7 @@
         </w:numPr>
       </w:pPr>
       <w:r>
+        <w:lastRenderedPageBreak/>
         <w:t xml:space="preserve">Add the following section at the end of the XML document, before the closing </w:t>
       </w:r>
       <w:r>
@@ -4592,7 +4610,6 @@
           <w:sz w:val="17"/>
           <w:szCs w:val="17"/>
         </w:rPr>
-        <w:lastRenderedPageBreak/>
         <w:t>&lt;archive&gt;</w:t>
       </w:r>
     </w:p>
@@ -5457,6 +5474,7 @@
         <w:contextualSpacing/>
       </w:pPr>
       <w:r>
+        <w:lastRenderedPageBreak/>
         <w:t>&lt;/node&gt;</w:t>
       </w:r>
     </w:p>
@@ -5547,11 +5565,7 @@
         <w:tab/>
       </w:r>
       <w:r>
-        <w:t xml:space="preserve">This element contains information about a specific node that the MASS application will run on. The number of these elements will determine how </w:t>
-      </w:r>
-      <w:r>
-        <w:lastRenderedPageBreak/>
-        <w:t xml:space="preserve">many computing nodes will be used i.e. if there were eight </w:t>
+        <w:t xml:space="preserve">This element contains information about a specific node that the MASS application will run on. The number of these elements will determine how many computing nodes will be used i.e. if there were eight </w:t>
       </w:r>
       <w:r>
         <w:rPr>
@@ -6039,7 +6053,7 @@
 </file>
 
 <file path=word/endnotes.xml><?xml version="1.0" encoding="utf-8"?>
-<w:endnotes xmlns:wpc="http://schemas.microsoft.com/office/word/2010/wordprocessingCanvas" xmlns:mc="http://schemas.openxmlformats.org/markup-compatibility/2006" xmlns:o="urn:schemas-microsoft-com:office:office" xmlns:r="http://schemas.openxmlformats.org/officeDocument/2006/relationships" xmlns:m="http://schemas.openxmlformats.org/officeDocument/2006/math" xmlns:v="urn:schemas-microsoft-com:vml" xmlns:wp14="http://schemas.microsoft.com/office/word/2010/wordprocessingDrawing" xmlns:wp="http://schemas.openxmlformats.org/drawingml/2006/wordprocessingDrawing" xmlns:w10="urn:schemas-microsoft-com:office:word" xmlns:w="http://schemas.openxmlformats.org/wordprocessingml/2006/main" xmlns:w14="http://schemas.microsoft.com/office/word/2010/wordml" xmlns:w15="http://schemas.microsoft.com/office/word/2012/wordml" xmlns:wpg="http://schemas.microsoft.com/office/word/2010/wordprocessingGroup" xmlns:wpi="http://schemas.microsoft.com/office/word/2010/wordprocessingInk" xmlns:wne="http://schemas.microsoft.com/office/word/2006/wordml" xmlns:wps="http://schemas.microsoft.com/office/word/2010/wordprocessingShape" mc:Ignorable="w14 w15 wp14">
+<w:endnotes xmlns:wpc="http://schemas.microsoft.com/office/word/2010/wordprocessingCanvas" xmlns:cx="http://schemas.microsoft.com/office/drawing/2014/chartex" xmlns:cx1="http://schemas.microsoft.com/office/drawing/2015/9/8/chartex" xmlns:mc="http://schemas.openxmlformats.org/markup-compatibility/2006" xmlns:o="urn:schemas-microsoft-com:office:office" xmlns:r="http://schemas.openxmlformats.org/officeDocument/2006/relationships" xmlns:m="http://schemas.openxmlformats.org/officeDocument/2006/math" xmlns:v="urn:schemas-microsoft-com:vml" xmlns:wp14="http://schemas.microsoft.com/office/word/2010/wordprocessingDrawing" xmlns:wp="http://schemas.openxmlformats.org/drawingml/2006/wordprocessingDrawing" xmlns:w10="urn:schemas-microsoft-com:office:word" xmlns:w="http://schemas.openxmlformats.org/wordprocessingml/2006/main" xmlns:w14="http://schemas.microsoft.com/office/word/2010/wordml" xmlns:w15="http://schemas.microsoft.com/office/word/2012/wordml" xmlns:w16se="http://schemas.microsoft.com/office/word/2015/wordml/symex" xmlns:wpg="http://schemas.microsoft.com/office/word/2010/wordprocessingGroup" xmlns:wpi="http://schemas.microsoft.com/office/word/2010/wordprocessingInk" xmlns:wne="http://schemas.microsoft.com/office/word/2006/wordml" xmlns:wps="http://schemas.microsoft.com/office/word/2010/wordprocessingShape" mc:Ignorable="w14 w15 w16se wp14">
   <w:endnote w:type="separator" w:id="-1">
     <w:p>
       <w:r>
@@ -6058,7 +6072,7 @@
 </file>
 
 <file path=word/footer1.xml><?xml version="1.0" encoding="utf-8"?>
-<w:ftr xmlns:wpc="http://schemas.microsoft.com/office/word/2010/wordprocessingCanvas" xmlns:mc="http://schemas.openxmlformats.org/markup-compatibility/2006" xmlns:o="urn:schemas-microsoft-com:office:office" xmlns:r="http://schemas.openxmlformats.org/officeDocument/2006/relationships" xmlns:m="http://schemas.openxmlformats.org/officeDocument/2006/math" xmlns:v="urn:schemas-microsoft-com:vml" xmlns:wp14="http://schemas.microsoft.com/office/word/2010/wordprocessingDrawing" xmlns:wp="http://schemas.openxmlformats.org/drawingml/2006/wordprocessingDrawing" xmlns:w10="urn:schemas-microsoft-com:office:word" xmlns:w="http://schemas.openxmlformats.org/wordprocessingml/2006/main" xmlns:w14="http://schemas.microsoft.com/office/word/2010/wordml" xmlns:w15="http://schemas.microsoft.com/office/word/2012/wordml" xmlns:wpg="http://schemas.microsoft.com/office/word/2010/wordprocessingGroup" xmlns:wpi="http://schemas.microsoft.com/office/word/2010/wordprocessingInk" xmlns:wne="http://schemas.microsoft.com/office/word/2006/wordml" xmlns:wps="http://schemas.microsoft.com/office/word/2010/wordprocessingShape" mc:Ignorable="w14 w15 wp14">
+<w:ftr xmlns:wpc="http://schemas.microsoft.com/office/word/2010/wordprocessingCanvas" xmlns:cx="http://schemas.microsoft.com/office/drawing/2014/chartex" xmlns:cx1="http://schemas.microsoft.com/office/drawing/2015/9/8/chartex" xmlns:mc="http://schemas.openxmlformats.org/markup-compatibility/2006" xmlns:o="urn:schemas-microsoft-com:office:office" xmlns:r="http://schemas.openxmlformats.org/officeDocument/2006/relationships" xmlns:m="http://schemas.openxmlformats.org/officeDocument/2006/math" xmlns:v="urn:schemas-microsoft-com:vml" xmlns:wp14="http://schemas.microsoft.com/office/word/2010/wordprocessingDrawing" xmlns:wp="http://schemas.openxmlformats.org/drawingml/2006/wordprocessingDrawing" xmlns:w10="urn:schemas-microsoft-com:office:word" xmlns:w="http://schemas.openxmlformats.org/wordprocessingml/2006/main" xmlns:w14="http://schemas.microsoft.com/office/word/2010/wordml" xmlns:w15="http://schemas.microsoft.com/office/word/2012/wordml" xmlns:w16se="http://schemas.microsoft.com/office/word/2015/wordml/symex" xmlns:wpg="http://schemas.microsoft.com/office/word/2010/wordprocessingGroup" xmlns:wpi="http://schemas.microsoft.com/office/word/2010/wordprocessingInk" xmlns:wne="http://schemas.microsoft.com/office/word/2006/wordml" xmlns:wps="http://schemas.microsoft.com/office/word/2010/wordprocessingShape" mc:Ignorable="w14 w15 w16se wp14">
   <w:p>
     <w:pPr>
       <w:pStyle w:val="Footer"/>
@@ -6113,7 +6127,7 @@
         <w:b/>
         <w:noProof/>
       </w:rPr>
-      <w:t>6</w:t>
+      <w:t>7</w:t>
     </w:r>
     <w:r>
       <w:rPr>
@@ -6127,7 +6141,7 @@
 </file>
 
 <file path=word/footnotes.xml><?xml version="1.0" encoding="utf-8"?>
-<w:footnotes xmlns:wpc="http://schemas.microsoft.com/office/word/2010/wordprocessingCanvas" xmlns:mc="http://schemas.openxmlformats.org/markup-compatibility/2006" xmlns:o="urn:schemas-microsoft-com:office:office" xmlns:r="http://schemas.openxmlformats.org/officeDocument/2006/relationships" xmlns:m="http://schemas.openxmlformats.org/officeDocument/2006/math" xmlns:v="urn:schemas-microsoft-com:vml" xmlns:wp14="http://schemas.microsoft.com/office/word/2010/wordprocessingDrawing" xmlns:wp="http://schemas.openxmlformats.org/drawingml/2006/wordprocessingDrawing" xmlns:w10="urn:schemas-microsoft-com:office:word" xmlns:w="http://schemas.openxmlformats.org/wordprocessingml/2006/main" xmlns:w14="http://schemas.microsoft.com/office/word/2010/wordml" xmlns:w15="http://schemas.microsoft.com/office/word/2012/wordml" xmlns:wpg="http://schemas.microsoft.com/office/word/2010/wordprocessingGroup" xmlns:wpi="http://schemas.microsoft.com/office/word/2010/wordprocessingInk" xmlns:wne="http://schemas.microsoft.com/office/word/2006/wordml" xmlns:wps="http://schemas.microsoft.com/office/word/2010/wordprocessingShape" mc:Ignorable="w14 w15 wp14">
+<w:footnotes xmlns:wpc="http://schemas.microsoft.com/office/word/2010/wordprocessingCanvas" xmlns:cx="http://schemas.microsoft.com/office/drawing/2014/chartex" xmlns:cx1="http://schemas.microsoft.com/office/drawing/2015/9/8/chartex" xmlns:mc="http://schemas.openxmlformats.org/markup-compatibility/2006" xmlns:o="urn:schemas-microsoft-com:office:office" xmlns:r="http://schemas.openxmlformats.org/officeDocument/2006/relationships" xmlns:m="http://schemas.openxmlformats.org/officeDocument/2006/math" xmlns:v="urn:schemas-microsoft-com:vml" xmlns:wp14="http://schemas.microsoft.com/office/word/2010/wordprocessingDrawing" xmlns:wp="http://schemas.openxmlformats.org/drawingml/2006/wordprocessingDrawing" xmlns:w10="urn:schemas-microsoft-com:office:word" xmlns:w="http://schemas.openxmlformats.org/wordprocessingml/2006/main" xmlns:w14="http://schemas.microsoft.com/office/word/2010/wordml" xmlns:w15="http://schemas.microsoft.com/office/word/2012/wordml" xmlns:w16se="http://schemas.microsoft.com/office/word/2015/wordml/symex" xmlns:wpg="http://schemas.microsoft.com/office/word/2010/wordprocessingGroup" xmlns:wpi="http://schemas.microsoft.com/office/word/2010/wordprocessingInk" xmlns:wne="http://schemas.microsoft.com/office/word/2006/wordml" xmlns:wps="http://schemas.microsoft.com/office/word/2010/wordprocessingShape" mc:Ignorable="w14 w15 w16se wp14">
   <w:footnote w:type="separator" w:id="-1">
     <w:p>
       <w:r>
@@ -6146,7 +6160,7 @@
 </file>
 
 <file path=word/header1.xml><?xml version="1.0" encoding="utf-8"?>
-<w:hdr xmlns:wpc="http://schemas.microsoft.com/office/word/2010/wordprocessingCanvas" xmlns:mc="http://schemas.openxmlformats.org/markup-compatibility/2006" xmlns:o="urn:schemas-microsoft-com:office:office" xmlns:r="http://schemas.openxmlformats.org/officeDocument/2006/relationships" xmlns:m="http://schemas.openxmlformats.org/officeDocument/2006/math" xmlns:v="urn:schemas-microsoft-com:vml" xmlns:wp14="http://schemas.microsoft.com/office/word/2010/wordprocessingDrawing" xmlns:wp="http://schemas.openxmlformats.org/drawingml/2006/wordprocessingDrawing" xmlns:w10="urn:schemas-microsoft-com:office:word" xmlns:w="http://schemas.openxmlformats.org/wordprocessingml/2006/main" xmlns:w14="http://schemas.microsoft.com/office/word/2010/wordml" xmlns:w15="http://schemas.microsoft.com/office/word/2012/wordml" xmlns:wpg="http://schemas.microsoft.com/office/word/2010/wordprocessingGroup" xmlns:wpi="http://schemas.microsoft.com/office/word/2010/wordprocessingInk" xmlns:wne="http://schemas.microsoft.com/office/word/2006/wordml" xmlns:wps="http://schemas.microsoft.com/office/word/2010/wordprocessingShape" mc:Ignorable="w14 w15 wp14">
+<w:hdr xmlns:wpc="http://schemas.microsoft.com/office/word/2010/wordprocessingCanvas" xmlns:cx="http://schemas.microsoft.com/office/drawing/2014/chartex" xmlns:cx1="http://schemas.microsoft.com/office/drawing/2015/9/8/chartex" xmlns:mc="http://schemas.openxmlformats.org/markup-compatibility/2006" xmlns:o="urn:schemas-microsoft-com:office:office" xmlns:r="http://schemas.openxmlformats.org/officeDocument/2006/relationships" xmlns:m="http://schemas.openxmlformats.org/officeDocument/2006/math" xmlns:v="urn:schemas-microsoft-com:vml" xmlns:wp14="http://schemas.microsoft.com/office/word/2010/wordprocessingDrawing" xmlns:wp="http://schemas.openxmlformats.org/drawingml/2006/wordprocessingDrawing" xmlns:w10="urn:schemas-microsoft-com:office:word" xmlns:w="http://schemas.openxmlformats.org/wordprocessingml/2006/main" xmlns:w14="http://schemas.microsoft.com/office/word/2010/wordml" xmlns:w15="http://schemas.microsoft.com/office/word/2012/wordml" xmlns:w16se="http://schemas.microsoft.com/office/word/2015/wordml/symex" xmlns:wpg="http://schemas.microsoft.com/office/word/2010/wordprocessingGroup" xmlns:wpi="http://schemas.microsoft.com/office/word/2010/wordprocessingInk" xmlns:wne="http://schemas.microsoft.com/office/word/2006/wordml" xmlns:wps="http://schemas.microsoft.com/office/word/2010/wordprocessingShape" mc:Ignorable="w14 w15 w16se wp14">
   <w:p>
     <w:pPr>
       <w:pStyle w:val="Foot"/>
@@ -6176,7 +6190,7 @@
 </file>
 
 <file path=word/numbering.xml><?xml version="1.0" encoding="utf-8"?>
-<w:numbering xmlns:wpc="http://schemas.microsoft.com/office/word/2010/wordprocessingCanvas" xmlns:mc="http://schemas.openxmlformats.org/markup-compatibility/2006" xmlns:o="urn:schemas-microsoft-com:office:office" xmlns:r="http://schemas.openxmlformats.org/officeDocument/2006/relationships" xmlns:m="http://schemas.openxmlformats.org/officeDocument/2006/math" xmlns:v="urn:schemas-microsoft-com:vml" xmlns:wp14="http://schemas.microsoft.com/office/word/2010/wordprocessingDrawing" xmlns:wp="http://schemas.openxmlformats.org/drawingml/2006/wordprocessingDrawing" xmlns:w10="urn:schemas-microsoft-com:office:word" xmlns:w="http://schemas.openxmlformats.org/wordprocessingml/2006/main" xmlns:w14="http://schemas.microsoft.com/office/word/2010/wordml" xmlns:w15="http://schemas.microsoft.com/office/word/2012/wordml" xmlns:wpg="http://schemas.microsoft.com/office/word/2010/wordprocessingGroup" xmlns:wpi="http://schemas.microsoft.com/office/word/2010/wordprocessingInk" xmlns:wne="http://schemas.microsoft.com/office/word/2006/wordml" xmlns:wps="http://schemas.microsoft.com/office/word/2010/wordprocessingShape" mc:Ignorable="w14 w15 wp14">
+<w:numbering xmlns:wpc="http://schemas.microsoft.com/office/word/2010/wordprocessingCanvas" xmlns:cx="http://schemas.microsoft.com/office/drawing/2014/chartex" xmlns:cx1="http://schemas.microsoft.com/office/drawing/2015/9/8/chartex" xmlns:mc="http://schemas.openxmlformats.org/markup-compatibility/2006" xmlns:o="urn:schemas-microsoft-com:office:office" xmlns:r="http://schemas.openxmlformats.org/officeDocument/2006/relationships" xmlns:m="http://schemas.openxmlformats.org/officeDocument/2006/math" xmlns:v="urn:schemas-microsoft-com:vml" xmlns:wp14="http://schemas.microsoft.com/office/word/2010/wordprocessingDrawing" xmlns:wp="http://schemas.openxmlformats.org/drawingml/2006/wordprocessingDrawing" xmlns:w10="urn:schemas-microsoft-com:office:word" xmlns:w="http://schemas.openxmlformats.org/wordprocessingml/2006/main" xmlns:w14="http://schemas.microsoft.com/office/word/2010/wordml" xmlns:w15="http://schemas.microsoft.com/office/word/2012/wordml" xmlns:w16se="http://schemas.microsoft.com/office/word/2015/wordml/symex" xmlns:wpg="http://schemas.microsoft.com/office/word/2010/wordprocessingGroup" xmlns:wpi="http://schemas.microsoft.com/office/word/2010/wordprocessingInk" xmlns:wne="http://schemas.microsoft.com/office/word/2006/wordml" xmlns:wps="http://schemas.microsoft.com/office/word/2010/wordprocessingShape" mc:Ignorable="w14 w15 w16se wp14">
   <w:abstractNum w:abstractNumId="0" w15:restartNumberingAfterBreak="0">
     <w:nsid w:val="10A41A4D"/>
     <w:multiLevelType w:val="hybridMultilevel"/>
@@ -6931,7 +6945,7 @@
 </file>
 
 <file path=word/styles.xml><?xml version="1.0" encoding="utf-8"?>
-<w:styles xmlns:mc="http://schemas.openxmlformats.org/markup-compatibility/2006" xmlns:r="http://schemas.openxmlformats.org/officeDocument/2006/relationships" xmlns:w="http://schemas.openxmlformats.org/wordprocessingml/2006/main" xmlns:w14="http://schemas.microsoft.com/office/word/2010/wordml" xmlns:w15="http://schemas.microsoft.com/office/word/2012/wordml" mc:Ignorable="w14 w15">
+<w:styles xmlns:mc="http://schemas.openxmlformats.org/markup-compatibility/2006" xmlns:r="http://schemas.openxmlformats.org/officeDocument/2006/relationships" xmlns:w="http://schemas.openxmlformats.org/wordprocessingml/2006/main" xmlns:w14="http://schemas.microsoft.com/office/word/2010/wordml" xmlns:w15="http://schemas.microsoft.com/office/word/2012/wordml" xmlns:w16se="http://schemas.microsoft.com/office/word/2015/wordml/symex" mc:Ignorable="w14 w15 w16se">
   <w:docDefaults>
     <w:rPrDefault>
       <w:rPr>
@@ -8059,7 +8073,7 @@
 </file>
 
 <file path=customXml/itemProps1.xml><?xml version="1.0" encoding="utf-8"?>
-<ds:datastoreItem xmlns:ds="http://schemas.openxmlformats.org/officeDocument/2006/customXml" ds:itemID="{E4EF24C4-C96E-41A4-B419-9BAAAE29E19A}">
+<ds:datastoreItem xmlns:ds="http://schemas.openxmlformats.org/officeDocument/2006/customXml" ds:itemID="{84FA1219-E0F4-4571-A271-400A258ECB34}">
   <ds:schemaRefs>
     <ds:schemaRef ds:uri="http://schemas.openxmlformats.org/officeDocument/2006/bibliography"/>
   </ds:schemaRefs>

</xml_diff>